<commit_message>
chore: synchronize Yarn lockfile20
</commit_message>
<xml_diff>
--- a/STARTUPDALLFI/SOFTWARE TITLE.docx
+++ b/STARTUPDALLFI/SOFTWARE TITLE.docx
@@ -5,7 +5,6 @@
     <w:p>
       <w:pPr>
         <w:rPr>
-          <w:rFonts w:hint="cs"/>
           <w:rtl/>
           <w:lang w:bidi="ar-DZ"/>
         </w:rPr>
@@ -218,7 +217,7 @@
                     </pic:cNvPicPr>
                   </pic:nvPicPr>
                   <pic:blipFill>
-                    <a:blip r:embed="rId6" cstate="print">
+                    <a:blip r:embed="rId5" cstate="print">
                       <a:extLst>
                         <a:ext uri="{28A0092B-C50C-407E-A947-70E740481C1C}">
                           <a14:useLocalDpi xmlns:a14="http://schemas.microsoft.com/office/drawing/2010/main" val="0"/>
@@ -13014,86 +13013,43 @@
       </w:r>
     </w:p>
     <w:p>
-      <w:pPr>
-        <w:rPr>
-          <w:lang w:val="en-US"/>
-        </w:rPr>
-      </w:pPr>
-      <w:r>
-        <w:rPr>
-          <w:lang w:val="en-US"/>
-        </w:rPr>
-        <w:t xml:space="preserve">    "</w:t>
-      </w:r>
-      <w:proofErr w:type="spellStart"/>
-      <w:proofErr w:type="gramStart"/>
-      <w:r>
-        <w:rPr>
-          <w:lang w:val="en-US"/>
-        </w:rPr>
-        <w:t>src</w:t>
-      </w:r>
-      <w:proofErr w:type="spellEnd"/>
-      <w:proofErr w:type="gramEnd"/>
-      <w:r>
-        <w:rPr>
-          <w:lang w:val="en-US"/>
-        </w:rPr>
-        <w:t>\components\</w:t>
-      </w:r>
-      <w:proofErr w:type="spellStart"/>
-      <w:r>
-        <w:rPr>
-          <w:lang w:val="en-US"/>
-        </w:rPr>
+      <w:r>
+        <w:rPr>
+          <w:lang w:val="en-US"/>
+        </w:rPr>
+        <w:t xml:space="preserve">    </w:t>
+      </w:r>
+      <w:r>
+        <w:t>"src\components\</w:t>
+      </w:r>
+      <w:proofErr w:type="spellStart"/>
+      <w:r>
         <w:t>ui</w:t>
       </w:r>
       <w:proofErr w:type="spellEnd"/>
       <w:r>
-        <w:rPr>
-          <w:lang w:val="en-US"/>
-        </w:rPr>
         <w:t>", `</w:t>
       </w:r>
     </w:p>
     <w:p>
-      <w:pPr>
-        <w:rPr>
-          <w:lang w:val="en-US"/>
-        </w:rPr>
-      </w:pPr>
-      <w:r>
-        <w:rPr>
-          <w:lang w:val="en-US"/>
-        </w:rPr>
-        <w:t xml:space="preserve">    "</w:t>
-      </w:r>
-      <w:proofErr w:type="spellStart"/>
-      <w:r>
-        <w:rPr>
-          <w:lang w:val="en-US"/>
-        </w:rPr>
-        <w:t>src</w:t>
-      </w:r>
-      <w:proofErr w:type="spellEnd"/>
-      <w:r>
-        <w:rPr>
-          <w:lang w:val="en-US"/>
-        </w:rPr>
-        <w:t>\pages", `</w:t>
-      </w:r>
-    </w:p>
-    <w:p>
-      <w:pPr>
-        <w:rPr>
-          <w:lang w:val="en-US"/>
-        </w:rPr>
-      </w:pPr>
-      <w:r>
-        <w:rPr>
-          <w:lang w:val="en-US"/>
-        </w:rPr>
-        <w:t xml:space="preserve">    "</w:t>
+      <w:r>
+        <w:t xml:space="preserve">    "src\pages", `</w:t>
+      </w:r>
+    </w:p>
+    <w:p>
+      <w:pPr>
+        <w:rPr>
+          <w:lang w:val="en-US"/>
+        </w:rPr>
+      </w:pPr>
+      <w:r>
+        <w:t xml:space="preserve">    </w:t>
+      </w:r>
+      <w:r>
+        <w:rPr>
+          <w:lang w:val="en-US"/>
+        </w:rPr>
+        <w:t>"</w:t>
       </w:r>
       <w:proofErr w:type="spellStart"/>
       <w:r>
@@ -18337,16 +18293,30 @@
       </w:r>
     </w:p>
     <w:p>
-      <w:r>
-        <w:t>DELETE /api/v1/downloads</w:t>
-      </w:r>
-      <w:proofErr w:type="gramStart"/>
-      <w:r>
-        <w:t>/:</w:t>
-      </w:r>
-      <w:proofErr w:type="gramEnd"/>
-      <w:r>
-        <w:t>id</w:t>
+      <w:pPr>
+        <w:rPr>
+          <w:lang w:val="en-US"/>
+        </w:rPr>
+      </w:pPr>
+      <w:r>
+        <w:rPr>
+          <w:lang w:val="en-US"/>
+        </w:rPr>
+        <w:t>DELETE /</w:t>
+      </w:r>
+      <w:proofErr w:type="spellStart"/>
+      <w:r>
+        <w:rPr>
+          <w:lang w:val="en-US"/>
+        </w:rPr>
+        <w:t>api</w:t>
+      </w:r>
+      <w:proofErr w:type="spellEnd"/>
+      <w:r>
+        <w:rPr>
+          <w:lang w:val="en-US"/>
+        </w:rPr>
+        <w:t>/v1/downloads/:id</w:t>
       </w:r>
     </w:p>
     <w:p>
@@ -21553,6 +21523,11 @@
       </w:r>
     </w:p>
     <w:p>
+      <w:pPr>
+        <w:rPr>
+          <w:u w:val="single"/>
+        </w:rPr>
+      </w:pPr>
       <w:proofErr w:type="gramStart"/>
       <w:r>
         <w:t xml:space="preserve">  </w:t>
@@ -21562,6 +21537,7 @@
         <w:rPr>
           <w:b/>
           <w:bCs/>
+          <w:u w:val="single"/>
         </w:rPr>
         <w:t>Multi</w:t>
       </w:r>
@@ -21570,6 +21546,7 @@
         <w:rPr>
           <w:b/>
           <w:bCs/>
+          <w:u w:val="single"/>
         </w:rPr>
         <w:t>-thread</w:t>
       </w:r>
@@ -21578,6 +21555,7 @@
         <w:rPr>
           <w:b/>
           <w:bCs/>
+          <w:u w:val="single"/>
         </w:rPr>
         <w:t xml:space="preserve"> </w:t>
       </w:r>
@@ -21586,11 +21564,15 @@
         <w:rPr>
           <w:b/>
           <w:bCs/>
+          <w:u w:val="single"/>
         </w:rPr>
         <w:t>downloading</w:t>
       </w:r>
       <w:proofErr w:type="spellEnd"/>
       <w:r>
+        <w:rPr>
+          <w:u w:val="single"/>
+        </w:rPr>
         <w:t xml:space="preserve"> </w:t>
       </w:r>
     </w:p>
@@ -21600,16 +21582,28 @@
           <w:ilvl w:val="0"/>
           <w:numId w:val="3"/>
         </w:numPr>
-      </w:pPr>
-      <w:r>
+        <w:rPr>
+          <w:u w:val="single"/>
+        </w:rPr>
+      </w:pPr>
+      <w:r>
+        <w:rPr>
+          <w:u w:val="single"/>
+        </w:rPr>
         <w:t xml:space="preserve">Split files </w:t>
       </w:r>
       <w:proofErr w:type="spellStart"/>
       <w:r>
+        <w:rPr>
+          <w:u w:val="single"/>
+        </w:rPr>
         <w:t>into</w:t>
       </w:r>
       <w:proofErr w:type="spellEnd"/>
       <w:r>
+        <w:rPr>
+          <w:u w:val="single"/>
+        </w:rPr>
         <w:t xml:space="preserve"> multiple connections </w:t>
       </w:r>
     </w:p>
@@ -21619,21 +21613,36 @@
           <w:ilvl w:val="0"/>
           <w:numId w:val="3"/>
         </w:numPr>
-      </w:pPr>
-      <w:proofErr w:type="spellStart"/>
-      <w:r>
+        <w:rPr>
+          <w:u w:val="single"/>
+        </w:rPr>
+      </w:pPr>
+      <w:proofErr w:type="spellStart"/>
+      <w:r>
+        <w:rPr>
+          <w:u w:val="single"/>
+        </w:rPr>
         <w:t>Resume</w:t>
       </w:r>
       <w:proofErr w:type="spellEnd"/>
       <w:r>
+        <w:rPr>
+          <w:u w:val="single"/>
+        </w:rPr>
         <w:t xml:space="preserve"> </w:t>
       </w:r>
       <w:proofErr w:type="spellStart"/>
       <w:r>
+        <w:rPr>
+          <w:u w:val="single"/>
+        </w:rPr>
         <w:t>broken</w:t>
       </w:r>
       <w:proofErr w:type="spellEnd"/>
       <w:r>
+        <w:rPr>
+          <w:u w:val="single"/>
+        </w:rPr>
         <w:t xml:space="preserve"> downloads </w:t>
       </w:r>
     </w:p>
@@ -21643,21 +21652,36 @@
           <w:ilvl w:val="0"/>
           <w:numId w:val="3"/>
         </w:numPr>
-      </w:pPr>
-      <w:proofErr w:type="spellStart"/>
-      <w:r>
+        <w:rPr>
+          <w:u w:val="single"/>
+        </w:rPr>
+      </w:pPr>
+      <w:proofErr w:type="spellStart"/>
+      <w:r>
+        <w:rPr>
+          <w:u w:val="single"/>
+        </w:rPr>
         <w:t>Automatic</w:t>
       </w:r>
       <w:proofErr w:type="spellEnd"/>
       <w:r>
+        <w:rPr>
+          <w:u w:val="single"/>
+        </w:rPr>
         <w:t xml:space="preserve"> </w:t>
       </w:r>
       <w:proofErr w:type="spellStart"/>
       <w:r>
+        <w:rPr>
+          <w:u w:val="single"/>
+        </w:rPr>
         <w:t>retry</w:t>
       </w:r>
       <w:proofErr w:type="spellEnd"/>
       <w:r>
+        <w:rPr>
+          <w:u w:val="single"/>
+        </w:rPr>
         <w:t xml:space="preserve"> </w:t>
       </w:r>
     </w:p>
@@ -21667,28 +21691,49 @@
           <w:ilvl w:val="0"/>
           <w:numId w:val="3"/>
         </w:numPr>
-      </w:pPr>
-      <w:r>
+        <w:rPr>
+          <w:u w:val="single"/>
+        </w:rPr>
+      </w:pPr>
+      <w:r>
+        <w:rPr>
+          <w:u w:val="single"/>
+        </w:rPr>
         <w:t xml:space="preserve">Connection </w:t>
       </w:r>
       <w:proofErr w:type="spellStart"/>
       <w:r>
+        <w:rPr>
+          <w:u w:val="single"/>
+        </w:rPr>
         <w:t>optimization</w:t>
       </w:r>
       <w:proofErr w:type="spellEnd"/>
       <w:r>
+        <w:rPr>
+          <w:u w:val="single"/>
+        </w:rPr>
         <w:t xml:space="preserve"> </w:t>
       </w:r>
     </w:p>
     <w:p>
+      <w:pPr>
+        <w:rPr>
+          <w:u w:val="single"/>
+        </w:rPr>
+      </w:pPr>
       <w:proofErr w:type="gramStart"/>
       <w:r>
+        <w:rPr>
+          <w:u w:val="single"/>
+        </w:rPr>
         <w:t xml:space="preserve">  </w:t>
       </w:r>
       <w:r>
         <w:rPr>
           <w:b/>
           <w:bCs/>
+          <w:u w:val="single"/>
         </w:rPr>
         <w:t>Browser</w:t>
       </w:r>
@@ -21697,6 +21742,7 @@
         <w:rPr>
           <w:b/>
           <w:bCs/>
+          <w:u w:val="single"/>
         </w:rPr>
         <w:t xml:space="preserve"> </w:t>
       </w:r>
@@ -21705,11 +21751,15 @@
         <w:rPr>
           <w:b/>
           <w:bCs/>
+          <w:u w:val="single"/>
         </w:rPr>
         <w:t>integration</w:t>
       </w:r>
       <w:proofErr w:type="spellEnd"/>
       <w:r>
+        <w:rPr>
+          <w:u w:val="single"/>
+        </w:rPr>
         <w:t xml:space="preserve"> </w:t>
       </w:r>
     </w:p>
@@ -21719,16 +21769,28 @@
           <w:ilvl w:val="0"/>
           <w:numId w:val="4"/>
         </w:numPr>
-      </w:pPr>
-      <w:r>
+        <w:rPr>
+          <w:u w:val="single"/>
+        </w:rPr>
+      </w:pPr>
+      <w:r>
+        <w:rPr>
+          <w:u w:val="single"/>
+        </w:rPr>
         <w:t xml:space="preserve">Chrome / </w:t>
       </w:r>
       <w:proofErr w:type="spellStart"/>
       <w:r>
+        <w:rPr>
+          <w:u w:val="single"/>
+        </w:rPr>
         <w:t>Chromium</w:t>
       </w:r>
       <w:proofErr w:type="spellEnd"/>
       <w:r>
+        <w:rPr>
+          <w:u w:val="single"/>
+        </w:rPr>
         <w:t xml:space="preserve"> </w:t>
       </w:r>
     </w:p>
@@ -21738,8 +21800,14 @@
           <w:ilvl w:val="0"/>
           <w:numId w:val="4"/>
         </w:numPr>
-      </w:pPr>
-      <w:r>
+        <w:rPr>
+          <w:u w:val="single"/>
+        </w:rPr>
+      </w:pPr>
+      <w:r>
+        <w:rPr>
+          <w:u w:val="single"/>
+        </w:rPr>
         <w:t xml:space="preserve">Edge </w:t>
       </w:r>
     </w:p>
@@ -21749,8 +21817,14 @@
           <w:ilvl w:val="0"/>
           <w:numId w:val="4"/>
         </w:numPr>
-      </w:pPr>
-      <w:r>
+        <w:rPr>
+          <w:u w:val="single"/>
+        </w:rPr>
+      </w:pPr>
+      <w:r>
+        <w:rPr>
+          <w:u w:val="single"/>
+        </w:rPr>
         <w:t xml:space="preserve">Firefox </w:t>
       </w:r>
     </w:p>
@@ -21760,8 +21834,14 @@
           <w:ilvl w:val="0"/>
           <w:numId w:val="4"/>
         </w:numPr>
-      </w:pPr>
-      <w:r>
+        <w:rPr>
+          <w:u w:val="single"/>
+        </w:rPr>
+      </w:pPr>
+      <w:r>
+        <w:rPr>
+          <w:u w:val="single"/>
+        </w:rPr>
         <w:t xml:space="preserve">Brave </w:t>
       </w:r>
     </w:p>
@@ -21771,8 +21851,14 @@
           <w:ilvl w:val="0"/>
           <w:numId w:val="4"/>
         </w:numPr>
-      </w:pPr>
-      <w:r>
+        <w:rPr>
+          <w:u w:val="single"/>
+        </w:rPr>
+      </w:pPr>
+      <w:r>
+        <w:rPr>
+          <w:u w:val="single"/>
+        </w:rPr>
         <w:t xml:space="preserve">Opera </w:t>
       </w:r>
     </w:p>
@@ -21782,21 +21868,36 @@
           <w:ilvl w:val="0"/>
           <w:numId w:val="4"/>
         </w:numPr>
-      </w:pPr>
-      <w:proofErr w:type="spellStart"/>
-      <w:r>
+        <w:rPr>
+          <w:u w:val="single"/>
+        </w:rPr>
+      </w:pPr>
+      <w:proofErr w:type="spellStart"/>
+      <w:r>
+        <w:rPr>
+          <w:u w:val="single"/>
+        </w:rPr>
         <w:t>Automatic</w:t>
       </w:r>
       <w:proofErr w:type="spellEnd"/>
       <w:r>
+        <w:rPr>
+          <w:u w:val="single"/>
+        </w:rPr>
         <w:t xml:space="preserve"> </w:t>
       </w:r>
       <w:proofErr w:type="spellStart"/>
       <w:r>
+        <w:rPr>
+          <w:u w:val="single"/>
+        </w:rPr>
         <w:t>link</w:t>
       </w:r>
       <w:proofErr w:type="spellEnd"/>
       <w:r>
+        <w:rPr>
+          <w:u w:val="single"/>
+        </w:rPr>
         <w:t xml:space="preserve"> interception </w:t>
       </w:r>
     </w:p>
@@ -21808,18 +21909,30 @@
         </w:numPr>
       </w:pPr>
       <w:r>
+        <w:rPr>
+          <w:u w:val="single"/>
+        </w:rPr>
         <w:t xml:space="preserve">"Download </w:t>
       </w:r>
       <w:proofErr w:type="spellStart"/>
       <w:r>
+        <w:rPr>
+          <w:u w:val="single"/>
+        </w:rPr>
         <w:t>with</w:t>
       </w:r>
       <w:proofErr w:type="spellEnd"/>
       <w:r>
+        <w:rPr>
+          <w:u w:val="single"/>
+        </w:rPr>
         <w:t xml:space="preserve"> </w:t>
       </w:r>
       <w:proofErr w:type="spellStart"/>
       <w:r>
+        <w:rPr>
+          <w:u w:val="single"/>
+        </w:rPr>
         <w:t>Dallfi</w:t>
       </w:r>
       <w:proofErr w:type="spellEnd"/>
@@ -30252,6 +30365,4258 @@
           <w:lang w:val="en-US"/>
         </w:rPr>
       </w:pPr>
+    </w:p>
+    <w:p>
+      <w:pPr>
+        <w:rPr>
+          <w:b/>
+          <w:bCs/>
+          <w:lang w:val="en-US"/>
+        </w:rPr>
+      </w:pPr>
+      <w:r>
+        <w:rPr>
+          <w:b/>
+          <w:bCs/>
+          <w:lang w:val="en-US"/>
+        </w:rPr>
+        <w:t>The architecture you want</w:t>
+      </w:r>
+    </w:p>
+    <w:p>
+      <w:pPr>
+        <w:rPr>
+          <w:lang w:val="en-US"/>
+        </w:rPr>
+      </w:pPr>
+      <w:r>
+        <w:rPr>
+          <w:lang w:val="en-US"/>
+        </w:rPr>
+        <w:t xml:space="preserve">                    USER'S PC</w:t>
+      </w:r>
+    </w:p>
+    <w:p>
+      <w:pPr>
+        <w:rPr>
+          <w:lang w:val="en-US"/>
+        </w:rPr>
+      </w:pPr>
+      <w:r>
+        <w:rPr>
+          <w:lang w:val="en-US"/>
+        </w:rPr>
+        <w:t>┌───────────────────────────────────────────────────────┐</w:t>
+      </w:r>
+    </w:p>
+    <w:p>
+      <w:pPr>
+        <w:rPr>
+          <w:lang w:val="en-US"/>
+        </w:rPr>
+      </w:pPr>
+      <w:r>
+        <w:rPr>
+          <w:lang w:val="en-US"/>
+        </w:rPr>
+        <w:t>│                                                       │</w:t>
+      </w:r>
+    </w:p>
+    <w:p>
+      <w:pPr>
+        <w:rPr>
+          <w:lang w:val="en-US"/>
+        </w:rPr>
+      </w:pPr>
+      <w:r>
+        <w:rPr>
+          <w:lang w:val="en-US"/>
+        </w:rPr>
+        <w:t>│  Chrome / Edge                                        │</w:t>
+      </w:r>
+    </w:p>
+    <w:p>
+      <w:pPr>
+        <w:rPr>
+          <w:lang w:val="en-US"/>
+        </w:rPr>
+      </w:pPr>
+      <w:r>
+        <w:rPr>
+          <w:lang w:val="en-US"/>
+        </w:rPr>
+        <w:t>│       │                                               │</w:t>
+      </w:r>
+    </w:p>
+    <w:p>
+      <w:pPr>
+        <w:rPr>
+          <w:lang w:val="en-US"/>
+        </w:rPr>
+      </w:pPr>
+      <w:r>
+        <w:rPr>
+          <w:lang w:val="en-US"/>
+        </w:rPr>
+        <w:t xml:space="preserve">│       </w:t>
+      </w:r>
+      <w:r>
+        <w:rPr>
+          <w:rFonts w:ascii="Arial" w:hAnsi="Arial" w:cs="Arial"/>
+          <w:lang w:val="en-US"/>
+        </w:rPr>
+        <w:t>▼</w:t>
+      </w:r>
+      <w:r>
+        <w:rPr>
+          <w:lang w:val="en-US"/>
+        </w:rPr>
+        <w:t xml:space="preserve">                                               </w:t>
+      </w:r>
+      <w:r>
+        <w:rPr>
+          <w:rFonts w:ascii="Calibri" w:hAnsi="Calibri" w:cs="Calibri"/>
+          <w:lang w:val="en-US"/>
+        </w:rPr>
+        <w:t>│</w:t>
+      </w:r>
+    </w:p>
+    <w:p>
+      <w:pPr>
+        <w:rPr>
+          <w:lang w:val="en-US"/>
+        </w:rPr>
+      </w:pPr>
+      <w:r>
+        <w:rPr>
+          <w:lang w:val="en-US"/>
+        </w:rPr>
+        <w:t>│  ┌─────────────────────┐                              │</w:t>
+      </w:r>
+    </w:p>
+    <w:p>
+      <w:pPr>
+        <w:rPr>
+          <w:lang w:val="en-US"/>
+        </w:rPr>
+      </w:pPr>
+      <w:r>
+        <w:rPr>
+          <w:lang w:val="en-US"/>
+        </w:rPr>
+        <w:t>│  │ DALLFI Extension    │                              │</w:t>
+      </w:r>
+    </w:p>
+    <w:p>
+      <w:pPr>
+        <w:rPr>
+          <w:lang w:val="en-US"/>
+        </w:rPr>
+      </w:pPr>
+      <w:r>
+        <w:rPr>
+          <w:lang w:val="en-US"/>
+        </w:rPr>
+        <w:t>│  │                     │                              │</w:t>
+      </w:r>
+    </w:p>
+    <w:p>
+      <w:pPr>
+        <w:rPr>
+          <w:lang w:val="en-US"/>
+        </w:rPr>
+      </w:pPr>
+      <w:r>
+        <w:rPr>
+          <w:lang w:val="en-US"/>
+        </w:rPr>
+        <w:t>│  │ • Detect downloads  │                              │</w:t>
+      </w:r>
+    </w:p>
+    <w:p>
+      <w:pPr>
+        <w:rPr>
+          <w:lang w:val="en-US"/>
+        </w:rPr>
+      </w:pPr>
+      <w:r>
+        <w:rPr>
+          <w:lang w:val="en-US"/>
+        </w:rPr>
+        <w:t>│  │ • Detect media      │                              │</w:t>
+      </w:r>
+    </w:p>
+    <w:p>
+      <w:pPr>
+        <w:rPr>
+          <w:lang w:val="en-US"/>
+        </w:rPr>
+      </w:pPr>
+      <w:r>
+        <w:rPr>
+          <w:lang w:val="en-US"/>
+        </w:rPr>
+        <w:t>│  │ • Context menu      │                              │</w:t>
+      </w:r>
+    </w:p>
+    <w:p>
+      <w:pPr>
+        <w:rPr>
+          <w:lang w:val="en-US"/>
+        </w:rPr>
+      </w:pPr>
+      <w:r>
+        <w:rPr>
+          <w:lang w:val="en-US"/>
+        </w:rPr>
+        <w:t>│  │ • Send URL          │                              │</w:t>
+      </w:r>
+    </w:p>
+    <w:p>
+      <w:pPr>
+        <w:rPr>
+          <w:lang w:val="en-US"/>
+        </w:rPr>
+      </w:pPr>
+      <w:r>
+        <w:rPr>
+          <w:lang w:val="en-US"/>
+        </w:rPr>
+        <w:t>│  └──────────</w:t>
+      </w:r>
+      <w:r>
+        <w:rPr>
+          <w:rFonts w:ascii="MS Gothic" w:eastAsia="MS Gothic" w:hAnsi="MS Gothic" w:cs="MS Gothic" w:hint="eastAsia"/>
+          <w:lang w:val="en-US"/>
+        </w:rPr>
+        <w:t>┬</w:t>
+      </w:r>
+      <w:r>
+        <w:rPr>
+          <w:rFonts w:ascii="Calibri" w:hAnsi="Calibri" w:cs="Calibri"/>
+          <w:lang w:val="en-US"/>
+        </w:rPr>
+        <w:t>──────────┘</w:t>
+      </w:r>
+      <w:r>
+        <w:rPr>
+          <w:lang w:val="en-US"/>
+        </w:rPr>
+        <w:t xml:space="preserve">                              </w:t>
+      </w:r>
+      <w:r>
+        <w:rPr>
+          <w:rFonts w:ascii="Calibri" w:hAnsi="Calibri" w:cs="Calibri"/>
+          <w:lang w:val="en-US"/>
+        </w:rPr>
+        <w:t>│</w:t>
+      </w:r>
+    </w:p>
+    <w:p>
+      <w:pPr>
+        <w:rPr>
+          <w:lang w:val="en-US"/>
+        </w:rPr>
+      </w:pPr>
+      <w:r>
+        <w:rPr>
+          <w:lang w:val="en-US"/>
+        </w:rPr>
+        <w:t>│             │ Native Messaging                        │</w:t>
+      </w:r>
+    </w:p>
+    <w:p>
+      <w:pPr>
+        <w:rPr>
+          <w:lang w:val="en-US"/>
+        </w:rPr>
+      </w:pPr>
+      <w:r>
+        <w:rPr>
+          <w:lang w:val="en-US"/>
+        </w:rPr>
+        <w:t xml:space="preserve">│             </w:t>
+      </w:r>
+      <w:r>
+        <w:rPr>
+          <w:rFonts w:ascii="Arial" w:hAnsi="Arial" w:cs="Arial"/>
+          <w:lang w:val="en-US"/>
+        </w:rPr>
+        <w:t>▼</w:t>
+      </w:r>
+      <w:r>
+        <w:rPr>
+          <w:lang w:val="en-US"/>
+        </w:rPr>
+        <w:t xml:space="preserve">                                         </w:t>
+      </w:r>
+      <w:r>
+        <w:rPr>
+          <w:rFonts w:ascii="Calibri" w:hAnsi="Calibri" w:cs="Calibri"/>
+          <w:lang w:val="en-US"/>
+        </w:rPr>
+        <w:t>│</w:t>
+      </w:r>
+    </w:p>
+    <w:p>
+      <w:pPr>
+        <w:rPr>
+          <w:lang w:val="en-US"/>
+        </w:rPr>
+      </w:pPr>
+      <w:r>
+        <w:rPr>
+          <w:lang w:val="en-US"/>
+        </w:rPr>
+        <w:t>│  ┌─────────────────────┐                              │</w:t>
+      </w:r>
+    </w:p>
+    <w:p>
+      <w:pPr>
+        <w:rPr>
+          <w:lang w:val="en-US"/>
+        </w:rPr>
+      </w:pPr>
+      <w:r>
+        <w:rPr>
+          <w:lang w:val="en-US"/>
+        </w:rPr>
+        <w:t>│  │ DALLFI Windows App  │                              │</w:t>
+      </w:r>
+    </w:p>
+    <w:p>
+      <w:pPr>
+        <w:rPr>
+          <w:lang w:val="en-US"/>
+        </w:rPr>
+      </w:pPr>
+      <w:r>
+        <w:rPr>
+          <w:lang w:val="en-US"/>
+        </w:rPr>
+        <w:t>│  │ Tauri + React       │                              │</w:t>
+      </w:r>
+    </w:p>
+    <w:p>
+      <w:pPr>
+        <w:rPr>
+          <w:lang w:val="en-US"/>
+        </w:rPr>
+      </w:pPr>
+      <w:r>
+        <w:rPr>
+          <w:lang w:val="en-US"/>
+        </w:rPr>
+        <w:t>│  └──────────</w:t>
+      </w:r>
+      <w:r>
+        <w:rPr>
+          <w:rFonts w:ascii="MS Gothic" w:eastAsia="MS Gothic" w:hAnsi="MS Gothic" w:cs="MS Gothic" w:hint="eastAsia"/>
+          <w:lang w:val="en-US"/>
+        </w:rPr>
+        <w:t>┬</w:t>
+      </w:r>
+      <w:r>
+        <w:rPr>
+          <w:rFonts w:ascii="Calibri" w:hAnsi="Calibri" w:cs="Calibri"/>
+          <w:lang w:val="en-US"/>
+        </w:rPr>
+        <w:t>──────────┘</w:t>
+      </w:r>
+      <w:r>
+        <w:rPr>
+          <w:lang w:val="en-US"/>
+        </w:rPr>
+        <w:t xml:space="preserve">                              </w:t>
+      </w:r>
+      <w:r>
+        <w:rPr>
+          <w:rFonts w:ascii="Calibri" w:hAnsi="Calibri" w:cs="Calibri"/>
+          <w:lang w:val="en-US"/>
+        </w:rPr>
+        <w:t>│</w:t>
+      </w:r>
+    </w:p>
+    <w:p>
+      <w:pPr>
+        <w:rPr>
+          <w:lang w:val="en-US"/>
+        </w:rPr>
+      </w:pPr>
+      <w:r>
+        <w:rPr>
+          <w:lang w:val="en-US"/>
+        </w:rPr>
+        <w:t>│             │                                         │</w:t>
+      </w:r>
+    </w:p>
+    <w:p>
+      <w:pPr>
+        <w:rPr>
+          <w:lang w:val="en-US"/>
+        </w:rPr>
+      </w:pPr>
+      <w:r>
+        <w:rPr>
+          <w:lang w:val="en-US"/>
+        </w:rPr>
+        <w:t xml:space="preserve">│             </w:t>
+      </w:r>
+      <w:r>
+        <w:rPr>
+          <w:rFonts w:ascii="Arial" w:hAnsi="Arial" w:cs="Arial"/>
+          <w:lang w:val="en-US"/>
+        </w:rPr>
+        <w:t>▼</w:t>
+      </w:r>
+      <w:r>
+        <w:rPr>
+          <w:lang w:val="en-US"/>
+        </w:rPr>
+        <w:t xml:space="preserve">                                         </w:t>
+      </w:r>
+      <w:r>
+        <w:rPr>
+          <w:rFonts w:ascii="Calibri" w:hAnsi="Calibri" w:cs="Calibri"/>
+          <w:lang w:val="en-US"/>
+        </w:rPr>
+        <w:t>│</w:t>
+      </w:r>
+    </w:p>
+    <w:p>
+      <w:pPr>
+        <w:rPr>
+          <w:lang w:val="en-US"/>
+        </w:rPr>
+      </w:pPr>
+      <w:r>
+        <w:rPr>
+          <w:lang w:val="en-US"/>
+        </w:rPr>
+        <w:t>│  ┌─────────────────────┐                              │</w:t>
+      </w:r>
+    </w:p>
+    <w:p>
+      <w:pPr>
+        <w:rPr>
+          <w:lang w:val="en-US"/>
+        </w:rPr>
+      </w:pPr>
+      <w:r>
+        <w:rPr>
+          <w:lang w:val="en-US"/>
+        </w:rPr>
+        <w:t>│  │ Rust Download Engine│                              │</w:t>
+      </w:r>
+    </w:p>
+    <w:p>
+      <w:pPr>
+        <w:rPr>
+          <w:lang w:val="en-US"/>
+        </w:rPr>
+      </w:pPr>
+      <w:r>
+        <w:rPr>
+          <w:lang w:val="en-US"/>
+        </w:rPr>
+        <w:t>│  │                     │                              │</w:t>
+      </w:r>
+    </w:p>
+    <w:p>
+      <w:pPr>
+        <w:rPr>
+          <w:lang w:val="en-US"/>
+        </w:rPr>
+      </w:pPr>
+      <w:r>
+        <w:rPr>
+          <w:lang w:val="en-US"/>
+        </w:rPr>
+        <w:t>│  │ • Connections       │                              │</w:t>
+      </w:r>
+    </w:p>
+    <w:p>
+      <w:pPr>
+        <w:rPr>
+          <w:lang w:val="en-US"/>
+        </w:rPr>
+      </w:pPr>
+      <w:r>
+        <w:rPr>
+          <w:lang w:val="en-US"/>
+        </w:rPr>
+        <w:lastRenderedPageBreak/>
+        <w:t>│  │ • Resume            │                              │</w:t>
+      </w:r>
+    </w:p>
+    <w:p>
+      <w:pPr>
+        <w:rPr>
+          <w:lang w:val="en-US"/>
+        </w:rPr>
+      </w:pPr>
+      <w:r>
+        <w:rPr>
+          <w:lang w:val="en-US"/>
+        </w:rPr>
+        <w:t>│  │ • Retry             │                              │</w:t>
+      </w:r>
+    </w:p>
+    <w:p>
+      <w:pPr>
+        <w:rPr>
+          <w:lang w:val="en-US"/>
+        </w:rPr>
+      </w:pPr>
+      <w:r>
+        <w:rPr>
+          <w:lang w:val="en-US"/>
+        </w:rPr>
+        <w:t>│  │ • Queue             │                              │</w:t>
+      </w:r>
+    </w:p>
+    <w:p>
+      <w:pPr>
+        <w:rPr>
+          <w:lang w:val="en-US"/>
+        </w:rPr>
+      </w:pPr>
+      <w:r>
+        <w:rPr>
+          <w:lang w:val="en-US"/>
+        </w:rPr>
+        <w:t>│  │ • Scheduler         │                              │</w:t>
+      </w:r>
+    </w:p>
+    <w:p>
+      <w:pPr>
+        <w:rPr>
+          <w:lang w:val="en-US"/>
+        </w:rPr>
+      </w:pPr>
+      <w:r>
+        <w:rPr>
+          <w:lang w:val="en-US"/>
+        </w:rPr>
+        <w:t>│  │ • Speed control     │                              │</w:t>
+      </w:r>
+    </w:p>
+    <w:p>
+      <w:pPr>
+        <w:rPr>
+          <w:lang w:val="en-US"/>
+        </w:rPr>
+      </w:pPr>
+      <w:r>
+        <w:rPr>
+          <w:lang w:val="en-US"/>
+        </w:rPr>
+        <w:t>│  └──────────</w:t>
+      </w:r>
+      <w:r>
+        <w:rPr>
+          <w:rFonts w:ascii="MS Gothic" w:eastAsia="MS Gothic" w:hAnsi="MS Gothic" w:cs="MS Gothic" w:hint="eastAsia"/>
+          <w:lang w:val="en-US"/>
+        </w:rPr>
+        <w:t>┬</w:t>
+      </w:r>
+      <w:r>
+        <w:rPr>
+          <w:rFonts w:ascii="Calibri" w:hAnsi="Calibri" w:cs="Calibri"/>
+          <w:lang w:val="en-US"/>
+        </w:rPr>
+        <w:t>──────────┘</w:t>
+      </w:r>
+      <w:r>
+        <w:rPr>
+          <w:lang w:val="en-US"/>
+        </w:rPr>
+        <w:t xml:space="preserve">                              </w:t>
+      </w:r>
+      <w:r>
+        <w:rPr>
+          <w:rFonts w:ascii="Calibri" w:hAnsi="Calibri" w:cs="Calibri"/>
+          <w:lang w:val="en-US"/>
+        </w:rPr>
+        <w:t>│</w:t>
+      </w:r>
+    </w:p>
+    <w:p>
+      <w:pPr>
+        <w:rPr>
+          <w:lang w:val="en-US"/>
+        </w:rPr>
+      </w:pPr>
+      <w:r>
+        <w:rPr>
+          <w:lang w:val="en-US"/>
+        </w:rPr>
+        <w:t>│             │                                         │</w:t>
+      </w:r>
+    </w:p>
+    <w:p>
+      <w:pPr>
+        <w:rPr>
+          <w:lang w:val="en-US"/>
+        </w:rPr>
+      </w:pPr>
+      <w:r>
+        <w:rPr>
+          <w:lang w:val="en-US"/>
+        </w:rPr>
+        <w:t xml:space="preserve">│             </w:t>
+      </w:r>
+      <w:r>
+        <w:rPr>
+          <w:rFonts w:ascii="Arial" w:hAnsi="Arial" w:cs="Arial"/>
+          <w:lang w:val="en-US"/>
+        </w:rPr>
+        <w:t>▼</w:t>
+      </w:r>
+      <w:r>
+        <w:rPr>
+          <w:lang w:val="en-US"/>
+        </w:rPr>
+        <w:t xml:space="preserve">                                         </w:t>
+      </w:r>
+      <w:r>
+        <w:rPr>
+          <w:rFonts w:ascii="Calibri" w:hAnsi="Calibri" w:cs="Calibri"/>
+          <w:lang w:val="en-US"/>
+        </w:rPr>
+        <w:t>│</w:t>
+      </w:r>
+    </w:p>
+    <w:p>
+      <w:pPr>
+        <w:rPr>
+          <w:lang w:val="en-US"/>
+        </w:rPr>
+      </w:pPr>
+      <w:r>
+        <w:rPr>
+          <w:lang w:val="en-US"/>
+        </w:rPr>
+        <w:t>│       C:\Downloads\                                   │</w:t>
+      </w:r>
+    </w:p>
+    <w:p>
+      <w:pPr>
+        <w:rPr>
+          <w:lang w:val="en-US"/>
+        </w:rPr>
+      </w:pPr>
+      <w:r>
+        <w:rPr>
+          <w:lang w:val="en-US"/>
+        </w:rPr>
+        <w:t>│                                                       │</w:t>
+      </w:r>
+    </w:p>
+    <w:p>
+      <w:pPr>
+        <w:rPr>
+          <w:lang w:val="en-US"/>
+        </w:rPr>
+      </w:pPr>
+      <w:r>
+        <w:rPr>
+          <w:lang w:val="en-US"/>
+        </w:rPr>
+        <w:t>└───────────────────────────────────────────────────────┘</w:t>
+      </w:r>
+    </w:p>
+    <w:p>
+      <w:pPr>
+        <w:rPr>
+          <w:lang w:val="en-US"/>
+        </w:rPr>
+      </w:pPr>
+    </w:p>
+    <w:p>
+      <w:pPr>
+        <w:rPr>
+          <w:lang w:val="en-US"/>
+        </w:rPr>
+      </w:pPr>
+      <w:r>
+        <w:rPr>
+          <w:lang w:val="en-US"/>
+        </w:rPr>
+        <w:t xml:space="preserve">                  NO DALLFI SERVER</w:t>
+      </w:r>
+    </w:p>
+    <w:p>
+      <w:pPr>
+        <w:rPr>
+          <w:lang w:val="en-US"/>
+        </w:rPr>
+      </w:pPr>
+      <w:r>
+        <w:rPr>
+          <w:lang w:val="en-US"/>
+        </w:rPr>
+        <w:t xml:space="preserve">                  NO API</w:t>
+      </w:r>
+    </w:p>
+    <w:p>
+      <w:pPr>
+        <w:rPr>
+          <w:lang w:val="en-US"/>
+        </w:rPr>
+      </w:pPr>
+      <w:r>
+        <w:rPr>
+          <w:lang w:val="en-US"/>
+        </w:rPr>
+        <w:t xml:space="preserve">                  NO DATABASE ONLINE</w:t>
+      </w:r>
+    </w:p>
+    <w:p>
+      <w:pPr>
+        <w:rPr>
+          <w:lang w:val="en-US"/>
+        </w:rPr>
+      </w:pPr>
+      <w:r>
+        <w:rPr>
+          <w:lang w:val="en-US"/>
+        </w:rPr>
+        <w:t xml:space="preserve">Chrome officially supports exactly this kind of extension → native application communication through </w:t>
+      </w:r>
+      <w:r>
+        <w:rPr>
+          <w:b/>
+          <w:bCs/>
+          <w:lang w:val="en-US"/>
+        </w:rPr>
+        <w:t>Native Messaging</w:t>
+      </w:r>
+      <w:r>
+        <w:rPr>
+          <w:lang w:val="en-US"/>
+        </w:rPr>
+        <w:t xml:space="preserve">. The native host runs as a separate local process and communicates through stdin/stdout. </w:t>
+      </w:r>
+    </w:p>
+    <w:p>
+      <w:r>
+        <w:pict w14:anchorId="5C42AC9D">
+          <v:rect id="_x0000_i1100" style="width:0;height:1.5pt" o:hralign="center" o:hrstd="t" o:hr="t" fillcolor="#a0a0a0" stroked="f"/>
+        </w:pict>
+      </w:r>
+    </w:p>
+    <w:p>
+      <w:pPr>
+        <w:rPr>
+          <w:b/>
+          <w:bCs/>
+          <w:lang w:val="en-US"/>
+        </w:rPr>
+      </w:pPr>
+      <w:r>
+        <w:rPr>
+          <w:b/>
+          <w:bCs/>
+          <w:lang w:val="en-US"/>
+        </w:rPr>
+        <w:t>How the user experience works</w:t>
+      </w:r>
+    </w:p>
+    <w:p>
+      <w:pPr>
+        <w:rPr>
+          <w:lang w:val="en-US"/>
+        </w:rPr>
+      </w:pPr>
+      <w:r>
+        <w:rPr>
+          <w:lang w:val="en-US"/>
+        </w:rPr>
+        <w:t>Imagine the user installs:</w:t>
+      </w:r>
+    </w:p>
+    <w:p>
+      <w:pPr>
+        <w:rPr>
+          <w:lang w:val="en-US"/>
+        </w:rPr>
+      </w:pPr>
+      <w:r>
+        <w:rPr>
+          <w:lang w:val="en-US"/>
+        </w:rPr>
+        <w:t>Dallfi-Setup.exe</w:t>
+      </w:r>
+    </w:p>
+    <w:p>
+      <w:pPr>
+        <w:rPr>
+          <w:lang w:val="en-US"/>
+        </w:rPr>
+      </w:pPr>
+      <w:r>
+        <w:rPr>
+          <w:lang w:val="en-US"/>
+        </w:rPr>
+        <w:t>The installer installs:</w:t>
+      </w:r>
+    </w:p>
+    <w:p>
+      <w:pPr>
+        <w:rPr>
+          <w:lang w:val="en-US"/>
+        </w:rPr>
+      </w:pPr>
+      <w:r>
+        <w:rPr>
+          <w:lang w:val="en-US"/>
+        </w:rPr>
+        <w:t>DALLFI.exe</w:t>
+      </w:r>
+    </w:p>
+    <w:p>
+      <w:pPr>
+        <w:rPr>
+          <w:lang w:val="en-US"/>
+        </w:rPr>
+      </w:pPr>
+      <w:r>
+        <w:rPr>
+          <w:lang w:val="en-US"/>
+        </w:rPr>
+        <w:t>+</w:t>
+      </w:r>
+    </w:p>
+    <w:p>
+      <w:pPr>
+        <w:rPr>
+          <w:lang w:val="en-US"/>
+        </w:rPr>
+      </w:pPr>
+      <w:r>
+        <w:rPr>
+          <w:lang w:val="en-US"/>
+        </w:rPr>
+        <w:t>DALLFI Native Host</w:t>
+      </w:r>
+    </w:p>
+    <w:p>
+      <w:pPr>
+        <w:rPr>
+          <w:lang w:val="en-US"/>
+        </w:rPr>
+      </w:pPr>
+      <w:r>
+        <w:rPr>
+          <w:lang w:val="en-US"/>
+        </w:rPr>
+        <w:t>+</w:t>
+      </w:r>
+    </w:p>
+    <w:p>
+      <w:pPr>
+        <w:rPr>
+          <w:lang w:val="en-US"/>
+        </w:rPr>
+      </w:pPr>
+      <w:r>
+        <w:rPr>
+          <w:lang w:val="en-US"/>
+        </w:rPr>
+        <w:t>DALLFI Extension instructions</w:t>
+      </w:r>
+    </w:p>
+    <w:p>
+      <w:pPr>
+        <w:rPr>
+          <w:lang w:val="en-US"/>
+        </w:rPr>
+      </w:pPr>
+      <w:r>
+        <w:rPr>
+          <w:lang w:val="en-US"/>
+        </w:rPr>
+        <w:t>Then the user installs your Chrome extension.</w:t>
+      </w:r>
+    </w:p>
+    <w:p>
+      <w:pPr>
+        <w:rPr>
+          <w:lang w:val="en-US"/>
+        </w:rPr>
+      </w:pPr>
+      <w:r>
+        <w:rPr>
+          <w:lang w:val="en-US"/>
+        </w:rPr>
+        <w:lastRenderedPageBreak/>
+        <w:t>Now they visit a page containing:</w:t>
+      </w:r>
+    </w:p>
+    <w:p>
+      <w:pPr>
+        <w:rPr>
+          <w:lang w:val="en-US"/>
+        </w:rPr>
+      </w:pPr>
+      <w:r>
+        <w:rPr>
+          <w:lang w:val="en-US"/>
+        </w:rPr>
+        <w:t>movie.mp4</w:t>
+      </w:r>
+    </w:p>
+    <w:p>
+      <w:pPr>
+        <w:rPr>
+          <w:lang w:val="en-US"/>
+        </w:rPr>
+      </w:pPr>
+      <w:r>
+        <w:rPr>
+          <w:lang w:val="en-US"/>
+        </w:rPr>
+        <w:t>software.zip</w:t>
+      </w:r>
+    </w:p>
+    <w:p>
+      <w:pPr>
+        <w:rPr>
+          <w:lang w:val="en-US"/>
+        </w:rPr>
+      </w:pPr>
+      <w:r>
+        <w:rPr>
+          <w:lang w:val="en-US"/>
+        </w:rPr>
+        <w:t>document.pdf</w:t>
+      </w:r>
+    </w:p>
+    <w:p>
+      <w:pPr>
+        <w:rPr>
+          <w:lang w:val="en-US"/>
+        </w:rPr>
+      </w:pPr>
+      <w:r>
+        <w:rPr>
+          <w:lang w:val="en-US"/>
+        </w:rPr>
+        <w:t>music.mp3</w:t>
+      </w:r>
+    </w:p>
+    <w:p>
+      <w:pPr>
+        <w:rPr>
+          <w:lang w:val="en-US"/>
+        </w:rPr>
+      </w:pPr>
+      <w:r>
+        <w:rPr>
+          <w:lang w:val="en-US"/>
+        </w:rPr>
+        <w:t>image.jpg</w:t>
+      </w:r>
+    </w:p>
+    <w:p>
+      <w:pPr>
+        <w:rPr>
+          <w:lang w:val="en-US"/>
+        </w:rPr>
+      </w:pPr>
+      <w:r>
+        <w:rPr>
+          <w:lang w:val="en-US"/>
+        </w:rPr>
+        <w:t>DALLFI can detect relevant downloadable resources.</w:t>
+      </w:r>
+    </w:p>
+    <w:p>
+      <w:pPr>
+        <w:rPr>
+          <w:lang w:val="en-US"/>
+        </w:rPr>
+      </w:pPr>
+      <w:r>
+        <w:rPr>
+          <w:lang w:val="en-US"/>
+        </w:rPr>
+        <w:t>Then:</w:t>
+      </w:r>
+    </w:p>
+    <w:p>
+      <w:pPr>
+        <w:rPr>
+          <w:lang w:val="en-US"/>
+        </w:rPr>
+      </w:pPr>
+      <w:r>
+        <w:rPr>
+          <w:lang w:val="en-US"/>
+        </w:rPr>
+        <w:t>User clicks:</w:t>
+      </w:r>
+    </w:p>
+    <w:p>
+      <w:pPr>
+        <w:rPr>
+          <w:lang w:val="en-US"/>
+        </w:rPr>
+      </w:pPr>
+      <w:r>
+        <w:rPr>
+          <w:lang w:val="en-US"/>
+        </w:rPr>
+        <w:t>"Download with DALLFI"</w:t>
+      </w:r>
+    </w:p>
+    <w:p>
+      <w:pPr>
+        <w:rPr>
+          <w:lang w:val="en-US"/>
+        </w:rPr>
+      </w:pPr>
+      <w:r>
+        <w:rPr>
+          <w:lang w:val="en-US"/>
+        </w:rPr>
+        <w:t>The extension sends:</w:t>
+      </w:r>
+    </w:p>
+    <w:p>
+      <w:pPr>
+        <w:rPr>
+          <w:lang w:val="en-US"/>
+        </w:rPr>
+      </w:pPr>
+      <w:r>
+        <w:rPr>
+          <w:lang w:val="en-US"/>
+        </w:rPr>
+        <w:t>{</w:t>
+      </w:r>
+    </w:p>
+    <w:p>
+      <w:pPr>
+        <w:rPr>
+          <w:lang w:val="en-US"/>
+        </w:rPr>
+      </w:pPr>
+      <w:r>
+        <w:rPr>
+          <w:lang w:val="en-US"/>
+        </w:rPr>
+        <w:t xml:space="preserve">  "type": "DOWNLOAD",</w:t>
+      </w:r>
+    </w:p>
+    <w:p>
+      <w:pPr>
+        <w:rPr>
+          <w:lang w:val="en-US"/>
+        </w:rPr>
+      </w:pPr>
+      <w:r>
+        <w:rPr>
+          <w:lang w:val="en-US"/>
+        </w:rPr>
+        <w:t xml:space="preserve">  "url": "https://example.com/file.zip",</w:t>
+      </w:r>
+    </w:p>
+    <w:p>
+      <w:pPr>
+        <w:rPr>
+          <w:lang w:val="en-US"/>
+        </w:rPr>
+      </w:pPr>
+      <w:r>
+        <w:rPr>
+          <w:lang w:val="en-US"/>
+        </w:rPr>
+        <w:t xml:space="preserve">  "filename": "file.zip",</w:t>
+      </w:r>
+    </w:p>
+    <w:p>
+      <w:pPr>
+        <w:rPr>
+          <w:lang w:val="en-US"/>
+        </w:rPr>
+      </w:pPr>
+      <w:r>
+        <w:rPr>
+          <w:lang w:val="en-US"/>
+        </w:rPr>
+        <w:t xml:space="preserve">  "pageUrl": "https://example.com/page"</w:t>
+      </w:r>
+    </w:p>
+    <w:p>
+      <w:pPr>
+        <w:rPr>
+          <w:lang w:val="en-US"/>
+        </w:rPr>
+      </w:pPr>
+      <w:r>
+        <w:rPr>
+          <w:lang w:val="en-US"/>
+        </w:rPr>
+        <w:t>}</w:t>
+      </w:r>
+    </w:p>
+    <w:p>
+      <w:pPr>
+        <w:rPr>
+          <w:lang w:val="en-US"/>
+        </w:rPr>
+      </w:pPr>
+      <w:r>
+        <w:rPr>
+          <w:lang w:val="en-US"/>
+        </w:rPr>
+        <w:t>to the local native host.</w:t>
+      </w:r>
+    </w:p>
+    <w:p>
+      <w:pPr>
+        <w:rPr>
+          <w:lang w:val="en-US"/>
+        </w:rPr>
+      </w:pPr>
+      <w:r>
+        <w:rPr>
+          <w:lang w:val="en-US"/>
+        </w:rPr>
+        <w:t>The native host forwards it to DALLFI.</w:t>
+      </w:r>
+    </w:p>
+    <w:p>
+      <w:pPr>
+        <w:rPr>
+          <w:lang w:val="en-US"/>
+        </w:rPr>
+      </w:pPr>
+      <w:r>
+        <w:rPr>
+          <w:lang w:val="en-US"/>
+        </w:rPr>
+        <w:t>Then:</w:t>
+      </w:r>
+    </w:p>
+    <w:p>
+      <w:pPr>
+        <w:rPr>
+          <w:lang w:val="en-US"/>
+        </w:rPr>
+      </w:pPr>
+      <w:r>
+        <w:rPr>
+          <w:lang w:val="en-US"/>
+        </w:rPr>
+        <w:t>Extension</w:t>
+      </w:r>
+    </w:p>
+    <w:p>
+      <w:pPr>
+        <w:rPr>
+          <w:lang w:val="en-US"/>
+        </w:rPr>
+      </w:pPr>
+      <w:r>
+        <w:rPr>
+          <w:lang w:val="en-US"/>
+        </w:rPr>
+        <w:t xml:space="preserve">    ↓</w:t>
+      </w:r>
+    </w:p>
+    <w:p>
+      <w:pPr>
+        <w:rPr>
+          <w:lang w:val="en-US"/>
+        </w:rPr>
+      </w:pPr>
+      <w:r>
+        <w:rPr>
+          <w:lang w:val="en-US"/>
+        </w:rPr>
+        <w:t>Native Messaging</w:t>
+      </w:r>
+    </w:p>
+    <w:p>
+      <w:pPr>
+        <w:rPr>
+          <w:lang w:val="en-US"/>
+        </w:rPr>
+      </w:pPr>
+      <w:r>
+        <w:rPr>
+          <w:lang w:val="en-US"/>
+        </w:rPr>
+        <w:t xml:space="preserve">    ↓</w:t>
+      </w:r>
+    </w:p>
+    <w:p>
+      <w:pPr>
+        <w:rPr>
+          <w:lang w:val="en-US"/>
+        </w:rPr>
+      </w:pPr>
+      <w:r>
+        <w:rPr>
+          <w:lang w:val="en-US"/>
+        </w:rPr>
+        <w:t>DALLFI</w:t>
+      </w:r>
+    </w:p>
+    <w:p>
+      <w:pPr>
+        <w:rPr>
+          <w:lang w:val="en-US"/>
+        </w:rPr>
+      </w:pPr>
+      <w:r>
+        <w:rPr>
+          <w:lang w:val="en-US"/>
+        </w:rPr>
+        <w:t xml:space="preserve">    ↓</w:t>
+      </w:r>
+    </w:p>
+    <w:p>
+      <w:pPr>
+        <w:rPr>
+          <w:lang w:val="en-US"/>
+        </w:rPr>
+      </w:pPr>
+      <w:r>
+        <w:rPr>
+          <w:lang w:val="en-US"/>
+        </w:rPr>
+        <w:t>Rust</w:t>
+      </w:r>
+    </w:p>
+    <w:p>
+      <w:pPr>
+        <w:rPr>
+          <w:lang w:val="en-US"/>
+        </w:rPr>
+      </w:pPr>
+      <w:r>
+        <w:rPr>
+          <w:lang w:val="en-US"/>
+        </w:rPr>
+        <w:t xml:space="preserve">    ↓</w:t>
+      </w:r>
+    </w:p>
+    <w:p>
+      <w:pPr>
+        <w:rPr>
+          <w:lang w:val="en-US"/>
+        </w:rPr>
+      </w:pPr>
+      <w:r>
+        <w:rPr>
+          <w:lang w:val="en-US"/>
+        </w:rPr>
+        <w:lastRenderedPageBreak/>
+        <w:t>Download</w:t>
+      </w:r>
+    </w:p>
+    <w:p>
+      <w:pPr>
+        <w:rPr>
+          <w:lang w:val="en-US"/>
+        </w:rPr>
+      </w:pPr>
+      <w:r>
+        <w:rPr>
+          <w:lang w:val="en-US"/>
+        </w:rPr>
+        <w:t xml:space="preserve">No Internet connection to </w:t>
+      </w:r>
+      <w:r>
+        <w:rPr>
+          <w:b/>
+          <w:bCs/>
+          <w:lang w:val="en-US"/>
+        </w:rPr>
+        <w:t>your company</w:t>
+      </w:r>
+      <w:r>
+        <w:rPr>
+          <w:lang w:val="en-US"/>
+        </w:rPr>
+        <w:t xml:space="preserve"> is necessary.</w:t>
+      </w:r>
+    </w:p>
+    <w:p>
+      <w:pPr>
+        <w:rPr>
+          <w:lang w:val="en-US"/>
+        </w:rPr>
+      </w:pPr>
+      <w:r>
+        <w:rPr>
+          <w:lang w:val="en-US"/>
+        </w:rPr>
+        <w:t>The Internet connection is only:</w:t>
+      </w:r>
+    </w:p>
+    <w:p>
+      <w:r>
+        <w:t xml:space="preserve">DALLFI → </w:t>
+      </w:r>
+      <w:proofErr w:type="spellStart"/>
+      <w:r>
+        <w:t>actual</w:t>
+      </w:r>
+      <w:proofErr w:type="spellEnd"/>
+      <w:r>
+        <w:t xml:space="preserve"> file server</w:t>
+      </w:r>
+    </w:p>
+    <w:p>
+      <w:r>
+        <w:pict w14:anchorId="04E4FA40">
+          <v:rect id="_x0000_i1101" style="width:0;height:1.5pt" o:hralign="center" o:hrstd="t" o:hr="t" fillcolor="#a0a0a0" stroked="f"/>
+        </w:pict>
+      </w:r>
+    </w:p>
+    <w:p>
+      <w:pPr>
+        <w:rPr>
+          <w:b/>
+          <w:bCs/>
+          <w:lang w:val="en-US"/>
+        </w:rPr>
+      </w:pPr>
+      <w:r>
+        <w:rPr>
+          <w:b/>
+          <w:bCs/>
+          <w:lang w:val="en-US"/>
+        </w:rPr>
+        <w:t>The really important part: Native Messaging</w:t>
+      </w:r>
+    </w:p>
+    <w:p>
+      <w:pPr>
+        <w:rPr>
+          <w:lang w:val="en-US"/>
+        </w:rPr>
+      </w:pPr>
+      <w:r>
+        <w:rPr>
+          <w:lang w:val="en-US"/>
+        </w:rPr>
+        <w:t>This is how you connect the extension to your Windows software.</w:t>
+      </w:r>
+    </w:p>
+    <w:p>
+      <w:pPr>
+        <w:rPr>
+          <w:lang w:val="en-US"/>
+        </w:rPr>
+      </w:pPr>
+      <w:r>
+        <w:rPr>
+          <w:lang w:val="en-US"/>
+        </w:rPr>
+        <w:t xml:space="preserve">Chrome requires the native application to register a </w:t>
+      </w:r>
+      <w:r>
+        <w:rPr>
+          <w:b/>
+          <w:bCs/>
+          <w:lang w:val="en-US"/>
+        </w:rPr>
+        <w:t>Native Messaging Host</w:t>
+      </w:r>
+      <w:r>
+        <w:rPr>
+          <w:lang w:val="en-US"/>
+        </w:rPr>
+        <w:t xml:space="preserve">. On Windows, the installer registers a registry entry pointing to the native-host manifest. </w:t>
+      </w:r>
+    </w:p>
+    <w:p>
+      <w:pPr>
+        <w:rPr>
+          <w:lang w:val="en-US"/>
+        </w:rPr>
+      </w:pPr>
+      <w:r>
+        <w:rPr>
+          <w:lang w:val="en-US"/>
+        </w:rPr>
+        <w:t>For example:</w:t>
+      </w:r>
+    </w:p>
+    <w:p>
+      <w:pPr>
+        <w:rPr>
+          <w:lang w:val="en-US"/>
+        </w:rPr>
+      </w:pPr>
+      <w:r>
+        <w:rPr>
+          <w:lang w:val="en-US"/>
+        </w:rPr>
+        <w:t>HKCU</w:t>
+      </w:r>
+    </w:p>
+    <w:p>
+      <w:pPr>
+        <w:rPr>
+          <w:lang w:val="en-US"/>
+        </w:rPr>
+      </w:pPr>
+      <w:r>
+        <w:rPr>
+          <w:lang w:val="en-US"/>
+        </w:rPr>
+        <w:t>└── Software</w:t>
+      </w:r>
+    </w:p>
+    <w:p>
+      <w:pPr>
+        <w:rPr>
+          <w:lang w:val="en-US"/>
+        </w:rPr>
+      </w:pPr>
+      <w:r>
+        <w:rPr>
+          <w:lang w:val="en-US"/>
+        </w:rPr>
+        <w:t xml:space="preserve">    └── Google</w:t>
+      </w:r>
+    </w:p>
+    <w:p>
+      <w:pPr>
+        <w:rPr>
+          <w:lang w:val="en-US"/>
+        </w:rPr>
+      </w:pPr>
+      <w:r>
+        <w:rPr>
+          <w:lang w:val="en-US"/>
+        </w:rPr>
+        <w:t xml:space="preserve">        └── Chrome</w:t>
+      </w:r>
+    </w:p>
+    <w:p>
+      <w:pPr>
+        <w:rPr>
+          <w:lang w:val="en-US"/>
+        </w:rPr>
+      </w:pPr>
+      <w:r>
+        <w:rPr>
+          <w:lang w:val="en-US"/>
+        </w:rPr>
+        <w:t xml:space="preserve">            └── NativeMessagingHosts</w:t>
+      </w:r>
+    </w:p>
+    <w:p>
+      <w:pPr>
+        <w:rPr>
+          <w:lang w:val="en-US"/>
+        </w:rPr>
+      </w:pPr>
+      <w:r>
+        <w:rPr>
+          <w:lang w:val="en-US"/>
+        </w:rPr>
+        <w:t xml:space="preserve">                └── com.dallfi.download</w:t>
+      </w:r>
+    </w:p>
+    <w:p>
+      <w:pPr>
+        <w:rPr>
+          <w:lang w:val="en-US"/>
+        </w:rPr>
+      </w:pPr>
+      <w:r>
+        <w:rPr>
+          <w:lang w:val="en-US"/>
+        </w:rPr>
+        <w:t>with:</w:t>
+      </w:r>
+    </w:p>
+    <w:p>
+      <w:pPr>
+        <w:rPr>
+          <w:lang w:val="en-US"/>
+        </w:rPr>
+      </w:pPr>
+      <w:r>
+        <w:rPr>
+          <w:lang w:val="en-US"/>
+        </w:rPr>
+        <w:t>{</w:t>
+      </w:r>
+    </w:p>
+    <w:p>
+      <w:pPr>
+        <w:rPr>
+          <w:lang w:val="en-US"/>
+        </w:rPr>
+      </w:pPr>
+      <w:r>
+        <w:rPr>
+          <w:lang w:val="en-US"/>
+        </w:rPr>
+        <w:t xml:space="preserve">  "name": "com.dallfi.download",</w:t>
+      </w:r>
+    </w:p>
+    <w:p>
+      <w:pPr>
+        <w:rPr>
+          <w:lang w:val="en-US"/>
+        </w:rPr>
+      </w:pPr>
+      <w:r>
+        <w:rPr>
+          <w:lang w:val="en-US"/>
+        </w:rPr>
+        <w:t xml:space="preserve">  "description": "DALLFI Download Manager Native Host",</w:t>
+      </w:r>
+    </w:p>
+    <w:p>
+      <w:pPr>
+        <w:rPr>
+          <w:lang w:val="en-US"/>
+        </w:rPr>
+      </w:pPr>
+      <w:r>
+        <w:rPr>
+          <w:lang w:val="en-US"/>
+        </w:rPr>
+        <w:t xml:space="preserve">  "path": "C:\\Program Files\\DALLFI\\dallfi-native-host.exe",</w:t>
+      </w:r>
+    </w:p>
+    <w:p>
+      <w:pPr>
+        <w:rPr>
+          <w:lang w:val="en-US"/>
+        </w:rPr>
+      </w:pPr>
+      <w:r>
+        <w:rPr>
+          <w:lang w:val="en-US"/>
+        </w:rPr>
+        <w:t xml:space="preserve">  "type": "stdio",</w:t>
+      </w:r>
+    </w:p>
+    <w:p>
+      <w:pPr>
+        <w:rPr>
+          <w:lang w:val="en-US"/>
+        </w:rPr>
+      </w:pPr>
+      <w:r>
+        <w:rPr>
+          <w:lang w:val="en-US"/>
+        </w:rPr>
+        <w:t xml:space="preserve">  "allowed_origins": [</w:t>
+      </w:r>
+    </w:p>
+    <w:p>
+      <w:pPr>
+        <w:rPr>
+          <w:lang w:val="en-US"/>
+        </w:rPr>
+      </w:pPr>
+      <w:r>
+        <w:rPr>
+          <w:lang w:val="en-US"/>
+        </w:rPr>
+        <w:t xml:space="preserve">    "chrome-extension://YOUR_EXTENSION_ID/"</w:t>
+      </w:r>
+    </w:p>
+    <w:p>
+      <w:pPr>
+        <w:rPr>
+          <w:lang w:val="en-US"/>
+        </w:rPr>
+      </w:pPr>
+      <w:r>
+        <w:rPr>
+          <w:lang w:val="en-US"/>
+        </w:rPr>
+        <w:t xml:space="preserve">  ]</w:t>
+      </w:r>
+    </w:p>
+    <w:p>
+      <w:pPr>
+        <w:rPr>
+          <w:lang w:val="en-US"/>
+        </w:rPr>
+      </w:pPr>
+      <w:r>
+        <w:rPr>
+          <w:lang w:val="en-US"/>
+        </w:rPr>
+        <w:t>}</w:t>
+      </w:r>
+    </w:p>
+    <w:p>
+      <w:pPr>
+        <w:rPr>
+          <w:lang w:val="en-US"/>
+        </w:rPr>
+      </w:pPr>
+      <w:r>
+        <w:rPr>
+          <w:lang w:val="en-US"/>
+        </w:rPr>
+        <w:t xml:space="preserve">Chrome's documentation specifies this Windows registry mechanism and the allowed_origins restriction. </w:t>
+      </w:r>
+    </w:p>
+    <w:p>
+      <w:r>
+        <w:pict w14:anchorId="5F611C59">
+          <v:rect id="_x0000_i1102" style="width:0;height:1.5pt" o:hralign="center" o:hrstd="t" o:hr="t" fillcolor="#a0a0a0" stroked="f"/>
+        </w:pict>
+      </w:r>
+    </w:p>
+    <w:p>
+      <w:pPr>
+        <w:rPr>
+          <w:b/>
+          <w:bCs/>
+          <w:lang w:val="en-US"/>
+        </w:rPr>
+      </w:pPr>
+      <w:r>
+        <w:rPr>
+          <w:b/>
+          <w:bCs/>
+          <w:lang w:val="en-US"/>
+        </w:rPr>
+        <w:lastRenderedPageBreak/>
+        <w:t>Extension side</w:t>
+      </w:r>
+    </w:p>
+    <w:p>
+      <w:pPr>
+        <w:rPr>
+          <w:lang w:val="en-US"/>
+        </w:rPr>
+      </w:pPr>
+      <w:r>
+        <w:rPr>
+          <w:lang w:val="en-US"/>
+        </w:rPr>
+        <w:t>Your extension needs:</w:t>
+      </w:r>
+    </w:p>
+    <w:p>
+      <w:pPr>
+        <w:rPr>
+          <w:lang w:val="en-US"/>
+        </w:rPr>
+      </w:pPr>
+      <w:r>
+        <w:rPr>
+          <w:lang w:val="en-US"/>
+        </w:rPr>
+        <w:t>{</w:t>
+      </w:r>
+    </w:p>
+    <w:p>
+      <w:pPr>
+        <w:rPr>
+          <w:lang w:val="en-US"/>
+        </w:rPr>
+      </w:pPr>
+      <w:r>
+        <w:rPr>
+          <w:lang w:val="en-US"/>
+        </w:rPr>
+        <w:t xml:space="preserve">  "manifest_version": 3,</w:t>
+      </w:r>
+    </w:p>
+    <w:p>
+      <w:pPr>
+        <w:rPr>
+          <w:lang w:val="en-US"/>
+        </w:rPr>
+      </w:pPr>
+      <w:r>
+        <w:rPr>
+          <w:lang w:val="en-US"/>
+        </w:rPr>
+        <w:t xml:space="preserve">  "name": "DALLFI Download Manager",</w:t>
+      </w:r>
+    </w:p>
+    <w:p>
+      <w:pPr>
+        <w:rPr>
+          <w:lang w:val="en-US"/>
+        </w:rPr>
+      </w:pPr>
+      <w:r>
+        <w:rPr>
+          <w:lang w:val="en-US"/>
+        </w:rPr>
+        <w:t xml:space="preserve">  "version": "0.1.0",</w:t>
+      </w:r>
+    </w:p>
+    <w:p>
+      <w:pPr>
+        <w:rPr>
+          <w:lang w:val="en-US"/>
+        </w:rPr>
+      </w:pPr>
+    </w:p>
+    <w:p>
+      <w:pPr>
+        <w:rPr>
+          <w:lang w:val="en-US"/>
+        </w:rPr>
+      </w:pPr>
+      <w:r>
+        <w:rPr>
+          <w:lang w:val="en-US"/>
+        </w:rPr>
+        <w:t xml:space="preserve">  "permissions": [</w:t>
+      </w:r>
+    </w:p>
+    <w:p>
+      <w:pPr>
+        <w:rPr>
+          <w:lang w:val="en-US"/>
+        </w:rPr>
+      </w:pPr>
+      <w:r>
+        <w:rPr>
+          <w:lang w:val="en-US"/>
+        </w:rPr>
+        <w:t xml:space="preserve">    "downloads",</w:t>
+      </w:r>
+    </w:p>
+    <w:p>
+      <w:pPr>
+        <w:rPr>
+          <w:lang w:val="en-US"/>
+        </w:rPr>
+      </w:pPr>
+      <w:r>
+        <w:rPr>
+          <w:lang w:val="en-US"/>
+        </w:rPr>
+        <w:t xml:space="preserve">    "storage",</w:t>
+      </w:r>
+    </w:p>
+    <w:p>
+      <w:pPr>
+        <w:rPr>
+          <w:lang w:val="en-US"/>
+        </w:rPr>
+      </w:pPr>
+      <w:r>
+        <w:rPr>
+          <w:lang w:val="en-US"/>
+        </w:rPr>
+        <w:t xml:space="preserve">    "contextMenus",</w:t>
+      </w:r>
+    </w:p>
+    <w:p>
+      <w:pPr>
+        <w:rPr>
+          <w:lang w:val="en-US"/>
+        </w:rPr>
+      </w:pPr>
+      <w:r>
+        <w:rPr>
+          <w:lang w:val="en-US"/>
+        </w:rPr>
+        <w:t xml:space="preserve">    "nativeMessaging",</w:t>
+      </w:r>
+    </w:p>
+    <w:p>
+      <w:pPr>
+        <w:rPr>
+          <w:lang w:val="en-US"/>
+        </w:rPr>
+      </w:pPr>
+      <w:r>
+        <w:rPr>
+          <w:lang w:val="en-US"/>
+        </w:rPr>
+        <w:t xml:space="preserve">    "webRequest"</w:t>
+      </w:r>
+    </w:p>
+    <w:p>
+      <w:pPr>
+        <w:rPr>
+          <w:lang w:val="en-US"/>
+        </w:rPr>
+      </w:pPr>
+      <w:r>
+        <w:rPr>
+          <w:lang w:val="en-US"/>
+        </w:rPr>
+        <w:t xml:space="preserve">  ],</w:t>
+      </w:r>
+    </w:p>
+    <w:p>
+      <w:pPr>
+        <w:rPr>
+          <w:lang w:val="en-US"/>
+        </w:rPr>
+      </w:pPr>
+    </w:p>
+    <w:p>
+      <w:pPr>
+        <w:rPr>
+          <w:lang w:val="en-US"/>
+        </w:rPr>
+      </w:pPr>
+      <w:r>
+        <w:rPr>
+          <w:lang w:val="en-US"/>
+        </w:rPr>
+        <w:t xml:space="preserve">  "host_permissions": [</w:t>
+      </w:r>
+    </w:p>
+    <w:p>
+      <w:pPr>
+        <w:rPr>
+          <w:lang w:val="en-US"/>
+        </w:rPr>
+      </w:pPr>
+      <w:r>
+        <w:rPr>
+          <w:lang w:val="en-US"/>
+        </w:rPr>
+        <w:t xml:space="preserve">    "&lt;all_urls&gt;"</w:t>
+      </w:r>
+    </w:p>
+    <w:p>
+      <w:pPr>
+        <w:rPr>
+          <w:lang w:val="en-US"/>
+        </w:rPr>
+      </w:pPr>
+      <w:r>
+        <w:rPr>
+          <w:lang w:val="en-US"/>
+        </w:rPr>
+        <w:t xml:space="preserve">  ],</w:t>
+      </w:r>
+    </w:p>
+    <w:p>
+      <w:pPr>
+        <w:rPr>
+          <w:lang w:val="en-US"/>
+        </w:rPr>
+      </w:pPr>
+    </w:p>
+    <w:p>
+      <w:pPr>
+        <w:rPr>
+          <w:lang w:val="en-US"/>
+        </w:rPr>
+      </w:pPr>
+      <w:r>
+        <w:rPr>
+          <w:lang w:val="en-US"/>
+        </w:rPr>
+        <w:t xml:space="preserve">  "background": {</w:t>
+      </w:r>
+    </w:p>
+    <w:p>
+      <w:pPr>
+        <w:rPr>
+          <w:lang w:val="en-US"/>
+        </w:rPr>
+      </w:pPr>
+      <w:r>
+        <w:rPr>
+          <w:lang w:val="en-US"/>
+        </w:rPr>
+        <w:t xml:space="preserve">    "service_worker": "src/background/index.ts",</w:t>
+      </w:r>
+    </w:p>
+    <w:p>
+      <w:pPr>
+        <w:rPr>
+          <w:lang w:val="en-US"/>
+        </w:rPr>
+      </w:pPr>
+      <w:r>
+        <w:rPr>
+          <w:lang w:val="en-US"/>
+        </w:rPr>
+        <w:t xml:space="preserve">    "type": "module"</w:t>
+      </w:r>
+    </w:p>
+    <w:p>
+      <w:pPr>
+        <w:rPr>
+          <w:lang w:val="en-US"/>
+        </w:rPr>
+      </w:pPr>
+      <w:r>
+        <w:rPr>
+          <w:lang w:val="en-US"/>
+        </w:rPr>
+        <w:t xml:space="preserve">  }</w:t>
+      </w:r>
+    </w:p>
+    <w:p>
+      <w:pPr>
+        <w:rPr>
+          <w:lang w:val="en-US"/>
+        </w:rPr>
+      </w:pPr>
+      <w:r>
+        <w:rPr>
+          <w:lang w:val="en-US"/>
+        </w:rPr>
+        <w:t>}</w:t>
+      </w:r>
+    </w:p>
+    <w:p>
+      <w:pPr>
+        <w:rPr>
+          <w:lang w:val="en-US"/>
+        </w:rPr>
+      </w:pPr>
+      <w:r>
+        <w:rPr>
+          <w:lang w:val="en-US"/>
+        </w:rPr>
+        <w:t xml:space="preserve">The downloads API lets an extension initiate, monitor, manipulate and search downloads. </w:t>
+      </w:r>
+    </w:p>
+    <w:p>
+      <w:pPr>
+        <w:rPr>
+          <w:lang w:val="en-US"/>
+        </w:rPr>
+      </w:pPr>
+      <w:r>
+        <w:rPr>
+          <w:lang w:val="en-US"/>
+        </w:rPr>
+        <w:t xml:space="preserve">The nativeMessaging permission is what lets the extension communicate with your local DALLFI native application. </w:t>
+      </w:r>
+    </w:p>
+    <w:p>
+      <w:r>
+        <w:pict w14:anchorId="2B897DE4">
+          <v:rect id="_x0000_i1103" style="width:0;height:1.5pt" o:hralign="center" o:hrstd="t" o:hr="t" fillcolor="#a0a0a0" stroked="f"/>
+        </w:pict>
+      </w:r>
+    </w:p>
+    <w:p>
+      <w:pPr>
+        <w:rPr>
+          <w:b/>
+          <w:bCs/>
+          <w:lang w:val="en-US"/>
+        </w:rPr>
+      </w:pPr>
+      <w:r>
+        <w:rPr>
+          <w:b/>
+          <w:bCs/>
+          <w:lang w:val="en-US"/>
+        </w:rPr>
+        <w:lastRenderedPageBreak/>
+        <w:t>How to detect downloads</w:t>
+      </w:r>
+    </w:p>
+    <w:p>
+      <w:pPr>
+        <w:rPr>
+          <w:lang w:val="en-US"/>
+        </w:rPr>
+      </w:pPr>
+      <w:r>
+        <w:rPr>
+          <w:lang w:val="en-US"/>
+        </w:rPr>
+        <w:t>There are several layers.</w:t>
+      </w:r>
+    </w:p>
+    <w:p>
+      <w:pPr>
+        <w:rPr>
+          <w:b/>
+          <w:bCs/>
+          <w:lang w:val="en-US"/>
+        </w:rPr>
+      </w:pPr>
+      <w:r>
+        <w:rPr>
+          <w:b/>
+          <w:bCs/>
+          <w:lang w:val="en-US"/>
+        </w:rPr>
+        <w:t>Layer 1 — Normal download links</w:t>
+      </w:r>
+    </w:p>
+    <w:p>
+      <w:pPr>
+        <w:rPr>
+          <w:lang w:val="en-US"/>
+        </w:rPr>
+      </w:pPr>
+      <w:r>
+        <w:rPr>
+          <w:lang w:val="en-US"/>
+        </w:rPr>
+        <w:t>For example:</w:t>
+      </w:r>
+    </w:p>
+    <w:p>
+      <w:pPr>
+        <w:rPr>
+          <w:lang w:val="en-US"/>
+        </w:rPr>
+      </w:pPr>
+      <w:r>
+        <w:rPr>
+          <w:lang w:val="en-US"/>
+        </w:rPr>
+        <w:t>&lt;a href="https://example.com/file.zip"&gt;</w:t>
+      </w:r>
+    </w:p>
+    <w:p>
+      <w:pPr>
+        <w:rPr>
+          <w:lang w:val="en-US"/>
+        </w:rPr>
+      </w:pPr>
+      <w:r>
+        <w:rPr>
+          <w:lang w:val="en-US"/>
+        </w:rPr>
+        <w:t xml:space="preserve">    Download</w:t>
+      </w:r>
+    </w:p>
+    <w:p>
+      <w:pPr>
+        <w:rPr>
+          <w:lang w:val="en-US"/>
+        </w:rPr>
+      </w:pPr>
+      <w:r>
+        <w:rPr>
+          <w:lang w:val="en-US"/>
+        </w:rPr>
+        <w:t>&lt;/a&gt;</w:t>
+      </w:r>
+    </w:p>
+    <w:p>
+      <w:pPr>
+        <w:rPr>
+          <w:lang w:val="en-US"/>
+        </w:rPr>
+      </w:pPr>
+      <w:r>
+        <w:rPr>
+          <w:lang w:val="en-US"/>
+        </w:rPr>
+        <w:t>Your content script can identify the link.</w:t>
+      </w:r>
+    </w:p>
+    <w:p>
+      <w:pPr>
+        <w:rPr>
+          <w:lang w:val="en-US"/>
+        </w:rPr>
+      </w:pPr>
+      <w:r>
+        <w:rPr>
+          <w:lang w:val="en-US"/>
+        </w:rPr>
+        <w:t>Then:</w:t>
+      </w:r>
+    </w:p>
+    <w:p>
+      <w:pPr>
+        <w:rPr>
+          <w:lang w:val="en-US"/>
+        </w:rPr>
+      </w:pPr>
+      <w:r>
+        <w:rPr>
+          <w:lang w:val="en-US"/>
+        </w:rPr>
+        <w:t>Download with DALLFI</w:t>
+      </w:r>
+    </w:p>
+    <w:p>
+      <w:pPr>
+        <w:rPr>
+          <w:lang w:val="en-US"/>
+        </w:rPr>
+      </w:pPr>
+      <w:r>
+        <w:rPr>
+          <w:lang w:val="en-US"/>
+        </w:rPr>
+        <w:t>can be shown in the context menu.</w:t>
+      </w:r>
+    </w:p>
+    <w:p>
+      <w:pPr>
+        <w:rPr>
+          <w:lang w:val="en-US"/>
+        </w:rPr>
+      </w:pPr>
+      <w:r>
+        <w:rPr>
+          <w:lang w:val="en-US"/>
+        </w:rPr>
+        <w:t xml:space="preserve">Your extension can also use the Chrome Downloads API as a fallback. </w:t>
+      </w:r>
+    </w:p>
+    <w:p>
+      <w:r>
+        <w:pict w14:anchorId="54AF5B75">
+          <v:rect id="_x0000_i1104" style="width:0;height:1.5pt" o:hralign="center" o:hrstd="t" o:hr="t" fillcolor="#a0a0a0" stroked="f"/>
+        </w:pict>
+      </w:r>
+    </w:p>
+    <w:p>
+      <w:pPr>
+        <w:rPr>
+          <w:b/>
+          <w:bCs/>
+          <w:lang w:val="en-US"/>
+        </w:rPr>
+      </w:pPr>
+      <w:r>
+        <w:rPr>
+          <w:b/>
+          <w:bCs/>
+          <w:lang w:val="en-US"/>
+        </w:rPr>
+        <w:t>Layer 2 — Network request detection</w:t>
+      </w:r>
+    </w:p>
+    <w:p>
+      <w:pPr>
+        <w:rPr>
+          <w:lang w:val="en-US"/>
+        </w:rPr>
+      </w:pPr>
+      <w:r>
+        <w:rPr>
+          <w:lang w:val="en-US"/>
+        </w:rPr>
+        <w:t>You can use chrome.webRequest to observe HTTP/HTTPS requests.</w:t>
+      </w:r>
+    </w:p>
+    <w:p>
+      <w:pPr>
+        <w:rPr>
+          <w:lang w:val="en-US"/>
+        </w:rPr>
+      </w:pPr>
+      <w:r>
+        <w:rPr>
+          <w:lang w:val="en-US"/>
+        </w:rPr>
+        <w:t xml:space="preserve">Chrome's current documentation says webRequest can observe and analyze network traffic, subject to permissions and host access. </w:t>
+      </w:r>
+    </w:p>
+    <w:p>
+      <w:pPr>
+        <w:rPr>
+          <w:lang w:val="en-US"/>
+        </w:rPr>
+      </w:pPr>
+      <w:r>
+        <w:rPr>
+          <w:lang w:val="en-US"/>
+        </w:rPr>
+        <w:t>Conceptually:</w:t>
+      </w:r>
+    </w:p>
+    <w:p>
+      <w:pPr>
+        <w:rPr>
+          <w:lang w:val="en-US"/>
+        </w:rPr>
+      </w:pPr>
+      <w:r>
+        <w:rPr>
+          <w:lang w:val="en-US"/>
+        </w:rPr>
+        <w:t>Browser</w:t>
+      </w:r>
+    </w:p>
+    <w:p>
+      <w:pPr>
+        <w:rPr>
+          <w:lang w:val="en-US"/>
+        </w:rPr>
+      </w:pPr>
+      <w:r>
+        <w:rPr>
+          <w:lang w:val="en-US"/>
+        </w:rPr>
+        <w:t xml:space="preserve">   │</w:t>
+      </w:r>
+    </w:p>
+    <w:p>
+      <w:pPr>
+        <w:rPr>
+          <w:lang w:val="en-US"/>
+        </w:rPr>
+      </w:pPr>
+      <w:r>
+        <w:rPr>
+          <w:lang w:val="en-US"/>
+        </w:rPr>
+        <w:t xml:space="preserve">   </w:t>
+      </w:r>
+      <w:r>
+        <w:rPr>
+          <w:rFonts w:ascii="MS Gothic" w:eastAsia="MS Gothic" w:hAnsi="MS Gothic" w:cs="MS Gothic" w:hint="eastAsia"/>
+          <w:lang w:val="en-US"/>
+        </w:rPr>
+        <w:t>├</w:t>
+      </w:r>
+      <w:r>
+        <w:rPr>
+          <w:rFonts w:ascii="Calibri" w:hAnsi="Calibri" w:cs="Calibri"/>
+          <w:lang w:val="en-US"/>
+        </w:rPr>
+        <w:t>──</w:t>
+      </w:r>
+      <w:r>
+        <w:rPr>
+          <w:lang w:val="en-US"/>
+        </w:rPr>
+        <w:t xml:space="preserve"> page.html</w:t>
+      </w:r>
+    </w:p>
+    <w:p>
+      <w:pPr>
+        <w:rPr>
+          <w:lang w:val="en-US"/>
+        </w:rPr>
+      </w:pPr>
+      <w:r>
+        <w:rPr>
+          <w:lang w:val="en-US"/>
+        </w:rPr>
+        <w:t xml:space="preserve">   </w:t>
+      </w:r>
+      <w:r>
+        <w:rPr>
+          <w:rFonts w:ascii="MS Gothic" w:eastAsia="MS Gothic" w:hAnsi="MS Gothic" w:cs="MS Gothic" w:hint="eastAsia"/>
+          <w:lang w:val="en-US"/>
+        </w:rPr>
+        <w:t>├</w:t>
+      </w:r>
+      <w:r>
+        <w:rPr>
+          <w:rFonts w:ascii="Calibri" w:hAnsi="Calibri" w:cs="Calibri"/>
+          <w:lang w:val="en-US"/>
+        </w:rPr>
+        <w:t>──</w:t>
+      </w:r>
+      <w:r>
+        <w:rPr>
+          <w:lang w:val="en-US"/>
+        </w:rPr>
+        <w:t xml:space="preserve"> style.css</w:t>
+      </w:r>
+    </w:p>
+    <w:p>
+      <w:pPr>
+        <w:rPr>
+          <w:lang w:val="en-US"/>
+        </w:rPr>
+      </w:pPr>
+      <w:r>
+        <w:rPr>
+          <w:lang w:val="en-US"/>
+        </w:rPr>
+        <w:t xml:space="preserve">   </w:t>
+      </w:r>
+      <w:r>
+        <w:rPr>
+          <w:rFonts w:ascii="MS Gothic" w:eastAsia="MS Gothic" w:hAnsi="MS Gothic" w:cs="MS Gothic" w:hint="eastAsia"/>
+          <w:lang w:val="en-US"/>
+        </w:rPr>
+        <w:t>├</w:t>
+      </w:r>
+      <w:r>
+        <w:rPr>
+          <w:rFonts w:ascii="Calibri" w:hAnsi="Calibri" w:cs="Calibri"/>
+          <w:lang w:val="en-US"/>
+        </w:rPr>
+        <w:t>──</w:t>
+      </w:r>
+      <w:r>
+        <w:rPr>
+          <w:lang w:val="en-US"/>
+        </w:rPr>
+        <w:t xml:space="preserve"> image.jpg</w:t>
+      </w:r>
+    </w:p>
+    <w:p>
+      <w:pPr>
+        <w:rPr>
+          <w:lang w:val="en-US"/>
+        </w:rPr>
+      </w:pPr>
+      <w:r>
+        <w:rPr>
+          <w:lang w:val="en-US"/>
+        </w:rPr>
+        <w:t xml:space="preserve">   </w:t>
+      </w:r>
+      <w:r>
+        <w:rPr>
+          <w:rFonts w:ascii="MS Gothic" w:eastAsia="MS Gothic" w:hAnsi="MS Gothic" w:cs="MS Gothic" w:hint="eastAsia"/>
+          <w:lang w:val="en-US"/>
+        </w:rPr>
+        <w:t>├</w:t>
+      </w:r>
+      <w:r>
+        <w:rPr>
+          <w:rFonts w:ascii="Calibri" w:hAnsi="Calibri" w:cs="Calibri"/>
+          <w:lang w:val="en-US"/>
+        </w:rPr>
+        <w:t>──</w:t>
+      </w:r>
+      <w:r>
+        <w:rPr>
+          <w:lang w:val="en-US"/>
+        </w:rPr>
+        <w:t xml:space="preserve"> video.mp4</w:t>
+      </w:r>
+    </w:p>
+    <w:p>
+      <w:pPr>
+        <w:rPr>
+          <w:lang w:val="en-US"/>
+        </w:rPr>
+      </w:pPr>
+      <w:r>
+        <w:rPr>
+          <w:lang w:val="en-US"/>
+        </w:rPr>
+        <w:t xml:space="preserve">   </w:t>
+      </w:r>
+      <w:r>
+        <w:rPr>
+          <w:rFonts w:ascii="MS Gothic" w:eastAsia="MS Gothic" w:hAnsi="MS Gothic" w:cs="MS Gothic" w:hint="eastAsia"/>
+          <w:lang w:val="en-US"/>
+        </w:rPr>
+        <w:t>├</w:t>
+      </w:r>
+      <w:r>
+        <w:rPr>
+          <w:rFonts w:ascii="Calibri" w:hAnsi="Calibri" w:cs="Calibri"/>
+          <w:lang w:val="en-US"/>
+        </w:rPr>
+        <w:t>──</w:t>
+      </w:r>
+      <w:r>
+        <w:rPr>
+          <w:lang w:val="en-US"/>
+        </w:rPr>
+        <w:t xml:space="preserve"> file.zip</w:t>
+      </w:r>
+    </w:p>
+    <w:p>
+      <w:pPr>
+        <w:rPr>
+          <w:lang w:val="en-US"/>
+        </w:rPr>
+      </w:pPr>
+      <w:r>
+        <w:rPr>
+          <w:lang w:val="en-US"/>
+        </w:rPr>
+        <w:t xml:space="preserve">   └── document.pdf</w:t>
+      </w:r>
+    </w:p>
+    <w:p>
+      <w:pPr>
+        <w:rPr>
+          <w:lang w:val="en-US"/>
+        </w:rPr>
+      </w:pPr>
+      <w:r>
+        <w:rPr>
+          <w:lang w:val="en-US"/>
+        </w:rPr>
+        <w:t xml:space="preserve">             │</w:t>
+      </w:r>
+    </w:p>
+    <w:p>
+      <w:pPr>
+        <w:rPr>
+          <w:lang w:val="en-US"/>
+        </w:rPr>
+      </w:pPr>
+      <w:r>
+        <w:rPr>
+          <w:lang w:val="en-US"/>
+        </w:rPr>
+        <w:t xml:space="preserve">             </w:t>
+      </w:r>
+      <w:r>
+        <w:rPr>
+          <w:rFonts w:ascii="Arial" w:hAnsi="Arial" w:cs="Arial"/>
+          <w:lang w:val="en-US"/>
+        </w:rPr>
+        <w:t>▼</w:t>
+      </w:r>
+    </w:p>
+    <w:p>
+      <w:pPr>
+        <w:rPr>
+          <w:lang w:val="en-US"/>
+        </w:rPr>
+      </w:pPr>
+      <w:r>
+        <w:rPr>
+          <w:lang w:val="en-US"/>
+        </w:rPr>
+        <w:lastRenderedPageBreak/>
+        <w:t xml:space="preserve">       DALLFI detector</w:t>
+      </w:r>
+    </w:p>
+    <w:p>
+      <w:pPr>
+        <w:rPr>
+          <w:lang w:val="en-US"/>
+        </w:rPr>
+      </w:pPr>
+      <w:r>
+        <w:rPr>
+          <w:lang w:val="en-US"/>
+        </w:rPr>
+        <w:t xml:space="preserve">             │</w:t>
+      </w:r>
+    </w:p>
+    <w:p>
+      <w:pPr>
+        <w:rPr>
+          <w:lang w:val="en-US"/>
+        </w:rPr>
+      </w:pPr>
+      <w:r>
+        <w:rPr>
+          <w:lang w:val="en-US"/>
+        </w:rPr>
+        <w:t xml:space="preserve">             </w:t>
+      </w:r>
+      <w:r>
+        <w:rPr>
+          <w:rFonts w:ascii="Arial" w:hAnsi="Arial" w:cs="Arial"/>
+          <w:lang w:val="en-US"/>
+        </w:rPr>
+        <w:t>▼</w:t>
+      </w:r>
+    </w:p>
+    <w:p>
+      <w:pPr>
+        <w:rPr>
+          <w:lang w:val="en-US"/>
+        </w:rPr>
+      </w:pPr>
+      <w:r>
+        <w:rPr>
+          <w:lang w:val="en-US"/>
+        </w:rPr>
+        <w:t xml:space="preserve">       Is this downloadable?</w:t>
+      </w:r>
+    </w:p>
+    <w:p>
+      <w:pPr>
+        <w:rPr>
+          <w:lang w:val="en-US"/>
+        </w:rPr>
+      </w:pPr>
+      <w:r>
+        <w:rPr>
+          <w:lang w:val="en-US"/>
+        </w:rPr>
+        <w:t xml:space="preserve">             │</w:t>
+      </w:r>
+    </w:p>
+    <w:p>
+      <w:pPr>
+        <w:rPr>
+          <w:lang w:val="en-US"/>
+        </w:rPr>
+      </w:pPr>
+      <w:r>
+        <w:rPr>
+          <w:lang w:val="en-US"/>
+        </w:rPr>
+        <w:t xml:space="preserve">       ┌─────</w:t>
+      </w:r>
+      <w:r>
+        <w:rPr>
+          <w:rFonts w:ascii="MS Gothic" w:eastAsia="MS Gothic" w:hAnsi="MS Gothic" w:cs="MS Gothic" w:hint="eastAsia"/>
+          <w:lang w:val="en-US"/>
+        </w:rPr>
+        <w:t>┴</w:t>
+      </w:r>
+      <w:r>
+        <w:rPr>
+          <w:rFonts w:ascii="Calibri" w:hAnsi="Calibri" w:cs="Calibri"/>
+          <w:lang w:val="en-US"/>
+        </w:rPr>
+        <w:t>─────┐</w:t>
+      </w:r>
+    </w:p>
+    <w:p>
+      <w:pPr>
+        <w:rPr>
+          <w:lang w:val="en-US"/>
+        </w:rPr>
+      </w:pPr>
+      <w:r>
+        <w:rPr>
+          <w:lang w:val="en-US"/>
+        </w:rPr>
+        <w:t xml:space="preserve">       │           │</w:t>
+      </w:r>
+    </w:p>
+    <w:p>
+      <w:pPr>
+        <w:rPr>
+          <w:lang w:val="en-US"/>
+        </w:rPr>
+      </w:pPr>
+      <w:r>
+        <w:rPr>
+          <w:lang w:val="en-US"/>
+        </w:rPr>
+        <w:t xml:space="preserve">      YES          NO</w:t>
+      </w:r>
+    </w:p>
+    <w:p>
+      <w:pPr>
+        <w:rPr>
+          <w:lang w:val="en-US"/>
+        </w:rPr>
+      </w:pPr>
+      <w:r>
+        <w:rPr>
+          <w:lang w:val="en-US"/>
+        </w:rPr>
+        <w:t xml:space="preserve">       │</w:t>
+      </w:r>
+    </w:p>
+    <w:p>
+      <w:pPr>
+        <w:rPr>
+          <w:lang w:val="en-US"/>
+        </w:rPr>
+      </w:pPr>
+      <w:r>
+        <w:rPr>
+          <w:lang w:val="en-US"/>
+        </w:rPr>
+        <w:t xml:space="preserve">       </w:t>
+      </w:r>
+      <w:r>
+        <w:rPr>
+          <w:rFonts w:ascii="Arial" w:hAnsi="Arial" w:cs="Arial"/>
+          <w:lang w:val="en-US"/>
+        </w:rPr>
+        <w:t>▼</w:t>
+      </w:r>
+    </w:p>
+    <w:p>
+      <w:pPr>
+        <w:rPr>
+          <w:lang w:val="en-US"/>
+        </w:rPr>
+      </w:pPr>
+      <w:r>
+        <w:rPr>
+          <w:lang w:val="en-US"/>
+        </w:rPr>
+        <w:t xml:space="preserve">   DALLFI</w:t>
+      </w:r>
+    </w:p>
+    <w:p>
+      <w:pPr>
+        <w:rPr>
+          <w:lang w:val="en-US"/>
+        </w:rPr>
+      </w:pPr>
+      <w:r>
+        <w:rPr>
+          <w:lang w:val="en-US"/>
+        </w:rPr>
+        <w:t>You can classify resources based on things such as:</w:t>
+      </w:r>
+    </w:p>
+    <w:p>
+      <w:r>
+        <w:t>URL extension</w:t>
+      </w:r>
+    </w:p>
+    <w:p>
+      <w:r>
+        <w:t>Content type</w:t>
+      </w:r>
+    </w:p>
+    <w:p>
+      <w:r>
+        <w:t>Content-Disposition</w:t>
+      </w:r>
+    </w:p>
+    <w:p>
+      <w:r>
+        <w:t>Resource type</w:t>
+      </w:r>
+    </w:p>
+    <w:p>
+      <w:r>
+        <w:t>File size</w:t>
+      </w:r>
+    </w:p>
+    <w:p>
+      <w:r>
+        <w:t xml:space="preserve">Page </w:t>
+      </w:r>
+      <w:proofErr w:type="spellStart"/>
+      <w:r>
+        <w:t>context</w:t>
+      </w:r>
+      <w:proofErr w:type="spellEnd"/>
+    </w:p>
+    <w:p>
+      <w:r>
+        <w:pict w14:anchorId="66548A38">
+          <v:rect id="_x0000_i1105" style="width:0;height:1.5pt" o:hralign="center" o:hrstd="t" o:hr="t" fillcolor="#a0a0a0" stroked="f"/>
+        </w:pict>
+      </w:r>
+    </w:p>
+    <w:p>
+      <w:pPr>
+        <w:rPr>
+          <w:b/>
+          <w:bCs/>
+          <w:lang w:val="en-US"/>
+        </w:rPr>
+      </w:pPr>
+      <w:r>
+        <w:rPr>
+          <w:b/>
+          <w:bCs/>
+          <w:lang w:val="en-US"/>
+        </w:rPr>
+        <w:t>Layer 3 — Media detection</w:t>
+      </w:r>
+    </w:p>
+    <w:p>
+      <w:pPr>
+        <w:rPr>
+          <w:lang w:val="en-US"/>
+        </w:rPr>
+      </w:pPr>
+      <w:r>
+        <w:rPr>
+          <w:lang w:val="en-US"/>
+        </w:rPr>
+        <w:t>This is where DALLFI can become much more interesting.</w:t>
+      </w:r>
+    </w:p>
+    <w:p>
+      <w:pPr>
+        <w:rPr>
+          <w:lang w:val="en-US"/>
+        </w:rPr>
+      </w:pPr>
+      <w:r>
+        <w:rPr>
+          <w:lang w:val="en-US"/>
+        </w:rPr>
+        <w:t>The content script can inspect the page for:</w:t>
+      </w:r>
+    </w:p>
+    <w:p>
+      <w:pPr>
+        <w:rPr>
+          <w:lang w:val="en-US"/>
+        </w:rPr>
+      </w:pPr>
+      <w:r>
+        <w:rPr>
+          <w:lang w:val="en-US"/>
+        </w:rPr>
+        <w:t>&lt;video&gt;</w:t>
+      </w:r>
+    </w:p>
+    <w:p>
+      <w:pPr>
+        <w:rPr>
+          <w:lang w:val="en-US"/>
+        </w:rPr>
+      </w:pPr>
+      <w:r>
+        <w:rPr>
+          <w:lang w:val="en-US"/>
+        </w:rPr>
+        <w:t>&lt;audio&gt;</w:t>
+      </w:r>
+    </w:p>
+    <w:p>
+      <w:pPr>
+        <w:rPr>
+          <w:lang w:val="en-US"/>
+        </w:rPr>
+      </w:pPr>
+      <w:r>
+        <w:rPr>
+          <w:lang w:val="en-US"/>
+        </w:rPr>
+        <w:t>and discover media sources.</w:t>
+      </w:r>
+    </w:p>
+    <w:p>
+      <w:pPr>
+        <w:rPr>
+          <w:lang w:val="en-US"/>
+        </w:rPr>
+      </w:pPr>
+      <w:r>
+        <w:rPr>
+          <w:lang w:val="en-US"/>
+        </w:rPr>
+        <w:t>For example:</w:t>
+      </w:r>
+    </w:p>
+    <w:p>
+      <w:pPr>
+        <w:rPr>
+          <w:lang w:val="en-US"/>
+        </w:rPr>
+      </w:pPr>
+      <w:r>
+        <w:rPr>
+          <w:lang w:val="en-US"/>
+        </w:rPr>
+        <w:t>video</w:t>
+      </w:r>
+    </w:p>
+    <w:p>
+      <w:pPr>
+        <w:rPr>
+          <w:lang w:val="en-US"/>
+        </w:rPr>
+      </w:pPr>
+      <w:r>
+        <w:rPr>
+          <w:lang w:val="en-US"/>
+        </w:rPr>
+        <w:t xml:space="preserve"> </w:t>
+      </w:r>
+      <w:r>
+        <w:rPr>
+          <w:rFonts w:ascii="MS Gothic" w:eastAsia="MS Gothic" w:hAnsi="MS Gothic" w:cs="MS Gothic" w:hint="eastAsia"/>
+          <w:lang w:val="en-US"/>
+        </w:rPr>
+        <w:t>├</w:t>
+      </w:r>
+      <w:r>
+        <w:rPr>
+          <w:rFonts w:ascii="Calibri" w:hAnsi="Calibri" w:cs="Calibri"/>
+          <w:lang w:val="en-US"/>
+        </w:rPr>
+        <w:t>──</w:t>
+      </w:r>
+      <w:r>
+        <w:rPr>
+          <w:lang w:val="en-US"/>
+        </w:rPr>
+        <w:t xml:space="preserve"> src</w:t>
+      </w:r>
+    </w:p>
+    <w:p>
+      <w:pPr>
+        <w:rPr>
+          <w:lang w:val="en-US"/>
+        </w:rPr>
+      </w:pPr>
+      <w:r>
+        <w:rPr>
+          <w:lang w:val="en-US"/>
+        </w:rPr>
+        <w:lastRenderedPageBreak/>
+        <w:t xml:space="preserve"> └── source elements</w:t>
+      </w:r>
+    </w:p>
+    <w:p>
+      <w:pPr>
+        <w:rPr>
+          <w:lang w:val="en-US"/>
+        </w:rPr>
+      </w:pPr>
+    </w:p>
+    <w:p>
+      <w:pPr>
+        <w:rPr>
+          <w:lang w:val="en-US"/>
+        </w:rPr>
+      </w:pPr>
+      <w:r>
+        <w:rPr>
+          <w:lang w:val="en-US"/>
+        </w:rPr>
+        <w:t>audio</w:t>
+      </w:r>
+    </w:p>
+    <w:p>
+      <w:pPr>
+        <w:rPr>
+          <w:lang w:val="en-US"/>
+        </w:rPr>
+      </w:pPr>
+      <w:r>
+        <w:rPr>
+          <w:lang w:val="en-US"/>
+        </w:rPr>
+        <w:t xml:space="preserve"> </w:t>
+      </w:r>
+      <w:r>
+        <w:rPr>
+          <w:rFonts w:ascii="MS Gothic" w:eastAsia="MS Gothic" w:hAnsi="MS Gothic" w:cs="MS Gothic" w:hint="eastAsia"/>
+          <w:lang w:val="en-US"/>
+        </w:rPr>
+        <w:t>├</w:t>
+      </w:r>
+      <w:r>
+        <w:rPr>
+          <w:rFonts w:ascii="Calibri" w:hAnsi="Calibri" w:cs="Calibri"/>
+          <w:lang w:val="en-US"/>
+        </w:rPr>
+        <w:t>──</w:t>
+      </w:r>
+      <w:r>
+        <w:rPr>
+          <w:lang w:val="en-US"/>
+        </w:rPr>
+        <w:t xml:space="preserve"> src</w:t>
+      </w:r>
+    </w:p>
+    <w:p>
+      <w:pPr>
+        <w:rPr>
+          <w:lang w:val="en-US"/>
+        </w:rPr>
+      </w:pPr>
+      <w:r>
+        <w:rPr>
+          <w:lang w:val="en-US"/>
+        </w:rPr>
+        <w:t xml:space="preserve"> └── source elements</w:t>
+      </w:r>
+    </w:p>
+    <w:p>
+      <w:pPr>
+        <w:rPr>
+          <w:lang w:val="en-US"/>
+        </w:rPr>
+      </w:pPr>
+      <w:r>
+        <w:rPr>
+          <w:lang w:val="en-US"/>
+        </w:rPr>
+        <w:t>Then:</w:t>
+      </w:r>
+    </w:p>
+    <w:p>
+      <w:pPr>
+        <w:rPr>
+          <w:lang w:val="en-US"/>
+        </w:rPr>
+      </w:pPr>
+      <w:r>
+        <w:rPr>
+          <w:lang w:val="en-US"/>
+        </w:rPr>
+        <w:t>Detected media</w:t>
+      </w:r>
+    </w:p>
+    <w:p>
+      <w:pPr>
+        <w:rPr>
+          <w:lang w:val="en-US"/>
+        </w:rPr>
+      </w:pPr>
+      <w:r>
+        <w:rPr>
+          <w:lang w:val="en-US"/>
+        </w:rPr>
+        <w:t xml:space="preserve">       ↓</w:t>
+      </w:r>
+    </w:p>
+    <w:p>
+      <w:pPr>
+        <w:rPr>
+          <w:lang w:val="en-US"/>
+        </w:rPr>
+      </w:pPr>
+      <w:r>
+        <w:rPr>
+          <w:lang w:val="en-US"/>
+        </w:rPr>
+        <w:t>DALLFI popup</w:t>
+      </w:r>
+    </w:p>
+    <w:p>
+      <w:pPr>
+        <w:rPr>
+          <w:lang w:val="en-US"/>
+        </w:rPr>
+      </w:pPr>
+      <w:r>
+        <w:rPr>
+          <w:lang w:val="en-US"/>
+        </w:rPr>
+        <w:t xml:space="preserve">       ↓</w:t>
+      </w:r>
+    </w:p>
+    <w:p>
+      <w:pPr>
+        <w:rPr>
+          <w:lang w:val="en-US"/>
+        </w:rPr>
+      </w:pPr>
+      <w:r>
+        <w:rPr>
+          <w:lang w:val="en-US"/>
+        </w:rPr>
+        <w:t>┌───────────────────────────┐</w:t>
+      </w:r>
+    </w:p>
+    <w:p>
+      <w:pPr>
+        <w:rPr>
+          <w:lang w:val="en-US"/>
+        </w:rPr>
+      </w:pPr>
+      <w:r>
+        <w:rPr>
+          <w:lang w:val="en-US"/>
+        </w:rPr>
+        <w:t>│ Available downloads       │</w:t>
+      </w:r>
+    </w:p>
+    <w:p>
+      <w:pPr>
+        <w:rPr>
+          <w:lang w:val="en-US"/>
+        </w:rPr>
+      </w:pPr>
+      <w:r>
+        <w:rPr>
+          <w:lang w:val="en-US"/>
+        </w:rPr>
+        <w:t>│                           │</w:t>
+      </w:r>
+    </w:p>
+    <w:p>
+      <w:pPr>
+        <w:rPr>
+          <w:lang w:val="en-US"/>
+        </w:rPr>
+      </w:pPr>
+      <w:r>
+        <w:rPr>
+          <w:lang w:val="en-US"/>
+        </w:rPr>
+        <w:t xml:space="preserve">│ </w:t>
+      </w:r>
+      <w:r>
+        <w:rPr>
+          <w:rFonts w:ascii="Segoe UI Emoji" w:hAnsi="Segoe UI Emoji" w:cs="Segoe UI Emoji"/>
+        </w:rPr>
+        <w:t>🎬</w:t>
+      </w:r>
+      <w:r>
+        <w:rPr>
+          <w:lang w:val="en-US"/>
+        </w:rPr>
+        <w:t xml:space="preserve"> video.mp4     820 MB   │</w:t>
+      </w:r>
+    </w:p>
+    <w:p>
+      <w:pPr>
+        <w:rPr>
+          <w:lang w:val="en-US"/>
+        </w:rPr>
+      </w:pPr>
+      <w:r>
+        <w:rPr>
+          <w:lang w:val="en-US"/>
+        </w:rPr>
+        <w:t xml:space="preserve">│ </w:t>
+      </w:r>
+      <w:r>
+        <w:rPr>
+          <w:rFonts w:ascii="Segoe UI Emoji" w:hAnsi="Segoe UI Emoji" w:cs="Segoe UI Emoji"/>
+        </w:rPr>
+        <w:t>🎵</w:t>
+      </w:r>
+      <w:r>
+        <w:rPr>
+          <w:lang w:val="en-US"/>
+        </w:rPr>
+        <w:t xml:space="preserve"> audio.mp3      12 MB   │</w:t>
+      </w:r>
+    </w:p>
+    <w:p>
+      <w:pPr>
+        <w:rPr>
+          <w:lang w:val="en-US"/>
+        </w:rPr>
+      </w:pPr>
+      <w:r>
+        <w:rPr>
+          <w:lang w:val="en-US"/>
+        </w:rPr>
+        <w:t xml:space="preserve">│ </w:t>
+      </w:r>
+      <w:r>
+        <w:rPr>
+          <w:rFonts w:ascii="Segoe UI Emoji" w:hAnsi="Segoe UI Emoji" w:cs="Segoe UI Emoji"/>
+        </w:rPr>
+        <w:t>📄</w:t>
+      </w:r>
+      <w:r>
+        <w:rPr>
+          <w:lang w:val="en-US"/>
+        </w:rPr>
+        <w:t xml:space="preserve"> document.pdf    4 MB   │</w:t>
+      </w:r>
+    </w:p>
+    <w:p>
+      <w:pPr>
+        <w:rPr>
+          <w:lang w:val="en-US"/>
+        </w:rPr>
+      </w:pPr>
+      <w:r>
+        <w:rPr>
+          <w:lang w:val="en-US"/>
+        </w:rPr>
+        <w:t>│                           │</w:t>
+      </w:r>
+    </w:p>
+    <w:p>
+      <w:pPr>
+        <w:rPr>
+          <w:lang w:val="en-US"/>
+        </w:rPr>
+      </w:pPr>
+      <w:r>
+        <w:rPr>
+          <w:lang w:val="en-US"/>
+        </w:rPr>
+        <w:t>│ [Download All]            │</w:t>
+      </w:r>
+    </w:p>
+    <w:p>
+      <w:r>
+        <w:t>└───────────────────────────┘</w:t>
+      </w:r>
+    </w:p>
+    <w:p>
+      <w:r>
+        <w:pict w14:anchorId="544763B4">
+          <v:rect id="_x0000_i1106" style="width:0;height:1.5pt" o:hralign="center" o:hrstd="t" o:hr="t" fillcolor="#a0a0a0" stroked="f"/>
+        </w:pict>
+      </w:r>
+    </w:p>
+    <w:p>
+      <w:pPr>
+        <w:rPr>
+          <w:b/>
+          <w:bCs/>
+          <w:lang w:val="en-US"/>
+        </w:rPr>
+      </w:pPr>
+      <w:r>
+        <w:rPr>
+          <w:b/>
+          <w:bCs/>
+          <w:lang w:val="en-US"/>
+        </w:rPr>
+        <w:t>But there is an important limitation</w:t>
+      </w:r>
+    </w:p>
+    <w:p>
+      <w:pPr>
+        <w:rPr>
+          <w:lang w:val="en-US"/>
+        </w:rPr>
+      </w:pPr>
+      <w:r>
+        <w:rPr>
+          <w:lang w:val="en-US"/>
+        </w:rPr>
+        <w:t xml:space="preserve">You </w:t>
+      </w:r>
+      <w:r>
+        <w:rPr>
+          <w:b/>
+          <w:bCs/>
+          <w:lang w:val="en-US"/>
+        </w:rPr>
+        <w:t>cannot assume every video on every website is a simple downloadable MP4</w:t>
+      </w:r>
+      <w:r>
+        <w:rPr>
+          <w:lang w:val="en-US"/>
+        </w:rPr>
+        <w:t>.</w:t>
+      </w:r>
+    </w:p>
+    <w:p>
+      <w:pPr>
+        <w:rPr>
+          <w:lang w:val="en-US"/>
+        </w:rPr>
+      </w:pPr>
+      <w:r>
+        <w:rPr>
+          <w:lang w:val="en-US"/>
+        </w:rPr>
+        <w:t>Modern websites can use:</w:t>
+      </w:r>
+    </w:p>
+    <w:p>
+      <w:pPr>
+        <w:rPr>
+          <w:lang w:val="en-US"/>
+        </w:rPr>
+      </w:pPr>
+      <w:r>
+        <w:rPr>
+          <w:lang w:val="en-US"/>
+        </w:rPr>
+        <w:t>MP4</w:t>
+      </w:r>
+    </w:p>
+    <w:p>
+      <w:pPr>
+        <w:rPr>
+          <w:lang w:val="en-US"/>
+        </w:rPr>
+      </w:pPr>
+      <w:r>
+        <w:rPr>
+          <w:lang w:val="en-US"/>
+        </w:rPr>
+        <w:t>WebM</w:t>
+      </w:r>
+    </w:p>
+    <w:p>
+      <w:pPr>
+        <w:rPr>
+          <w:lang w:val="en-US"/>
+        </w:rPr>
+      </w:pPr>
+      <w:r>
+        <w:rPr>
+          <w:lang w:val="en-US"/>
+        </w:rPr>
+        <w:t>HLS</w:t>
+      </w:r>
+    </w:p>
+    <w:p>
+      <w:pPr>
+        <w:rPr>
+          <w:lang w:val="en-US"/>
+        </w:rPr>
+      </w:pPr>
+      <w:r>
+        <w:rPr>
+          <w:lang w:val="en-US"/>
+        </w:rPr>
+        <w:t>DASH</w:t>
+      </w:r>
+    </w:p>
+    <w:p>
+      <w:pPr>
+        <w:rPr>
+          <w:lang w:val="en-US"/>
+        </w:rPr>
+      </w:pPr>
+      <w:r>
+        <w:rPr>
+          <w:lang w:val="en-US"/>
+        </w:rPr>
+        <w:t>MSE</w:t>
+      </w:r>
+    </w:p>
+    <w:p>
+      <w:pPr>
+        <w:rPr>
+          <w:lang w:val="en-US"/>
+        </w:rPr>
+      </w:pPr>
+      <w:r>
+        <w:rPr>
+          <w:lang w:val="en-US"/>
+        </w:rPr>
+        <w:lastRenderedPageBreak/>
+        <w:t>blob:</w:t>
+      </w:r>
+    </w:p>
+    <w:p>
+      <w:pPr>
+        <w:rPr>
+          <w:lang w:val="en-US"/>
+        </w:rPr>
+      </w:pPr>
+      <w:r>
+        <w:rPr>
+          <w:lang w:val="en-US"/>
+        </w:rPr>
+        <w:t>DRM/encrypted streams</w:t>
+      </w:r>
+    </w:p>
+    <w:p>
+      <w:pPr>
+        <w:rPr>
+          <w:lang w:val="en-US"/>
+        </w:rPr>
+      </w:pPr>
+      <w:r>
+        <w:rPr>
+          <w:lang w:val="en-US"/>
+        </w:rPr>
+        <w:t>For example:</w:t>
+      </w:r>
+    </w:p>
+    <w:p>
+      <w:pPr>
+        <w:rPr>
+          <w:lang w:val="en-US"/>
+        </w:rPr>
+      </w:pPr>
+      <w:r>
+        <w:rPr>
+          <w:lang w:val="en-US"/>
+        </w:rPr>
+        <w:t>Website</w:t>
+      </w:r>
+    </w:p>
+    <w:p>
+      <w:pPr>
+        <w:rPr>
+          <w:lang w:val="en-US"/>
+        </w:rPr>
+      </w:pPr>
+      <w:r>
+        <w:rPr>
+          <w:lang w:val="en-US"/>
+        </w:rPr>
+        <w:t xml:space="preserve">   ↓</w:t>
+      </w:r>
+    </w:p>
+    <w:p>
+      <w:pPr>
+        <w:rPr>
+          <w:lang w:val="en-US"/>
+        </w:rPr>
+      </w:pPr>
+      <w:r>
+        <w:rPr>
+          <w:lang w:val="en-US"/>
+        </w:rPr>
+        <w:t>Encrypted/segmented stream</w:t>
+      </w:r>
+    </w:p>
+    <w:p>
+      <w:pPr>
+        <w:rPr>
+          <w:lang w:val="en-US"/>
+        </w:rPr>
+      </w:pPr>
+      <w:r>
+        <w:rPr>
+          <w:lang w:val="en-US"/>
+        </w:rPr>
+        <w:t xml:space="preserve">   ↓</w:t>
+      </w:r>
+    </w:p>
+    <w:p>
+      <w:pPr>
+        <w:rPr>
+          <w:lang w:val="en-US"/>
+        </w:rPr>
+      </w:pPr>
+      <w:r>
+        <w:rPr>
+          <w:lang w:val="en-US"/>
+        </w:rPr>
+        <w:t>Browser media pipeline</w:t>
+      </w:r>
+    </w:p>
+    <w:p>
+      <w:pPr>
+        <w:rPr>
+          <w:lang w:val="en-US"/>
+        </w:rPr>
+      </w:pPr>
+      <w:r>
+        <w:rPr>
+          <w:lang w:val="en-US"/>
+        </w:rPr>
+        <w:t>is fundamentally different from:</w:t>
+      </w:r>
+    </w:p>
+    <w:p>
+      <w:pPr>
+        <w:rPr>
+          <w:lang w:val="en-US"/>
+        </w:rPr>
+      </w:pPr>
+      <w:r>
+        <w:rPr>
+          <w:lang w:val="en-US"/>
+        </w:rPr>
+        <w:t>https://example.com/video.mp4</w:t>
+      </w:r>
+    </w:p>
+    <w:p>
+      <w:pPr>
+        <w:rPr>
+          <w:lang w:val="en-US"/>
+        </w:rPr>
+      </w:pPr>
+      <w:r>
+        <w:rPr>
+          <w:lang w:val="en-US"/>
+        </w:rPr>
+        <w:t xml:space="preserve">DALLFI can handle ordinary downloadable resources and media URLs, but you should </w:t>
+      </w:r>
+      <w:r>
+        <w:rPr>
+          <w:b/>
+          <w:bCs/>
+          <w:lang w:val="en-US"/>
+        </w:rPr>
+        <w:t>not design the MVP around bypassing DRM or access controls</w:t>
+      </w:r>
+      <w:r>
+        <w:rPr>
+          <w:lang w:val="en-US"/>
+        </w:rPr>
+        <w:t>.</w:t>
+      </w:r>
+    </w:p>
+    <w:p>
+      <w:pPr>
+        <w:rPr>
+          <w:lang w:val="en-US"/>
+        </w:rPr>
+      </w:pPr>
+      <w:r>
+        <w:rPr>
+          <w:lang w:val="en-US"/>
+        </w:rPr>
+        <w:t xml:space="preserve">Your uploaded specification itself describes detection of video/audio elements and downloadable media URLs rather than DRM circumvention. </w:t>
+      </w:r>
+    </w:p>
+    <w:p>
+      <w:r>
+        <w:pict w14:anchorId="51C8D6AB">
+          <v:rect id="_x0000_i1107" style="width:0;height:1.5pt" o:hralign="center" o:hrstd="t" o:hr="t" fillcolor="#a0a0a0" stroked="f"/>
+        </w:pict>
+      </w:r>
+    </w:p>
+    <w:p>
+      <w:pPr>
+        <w:rPr>
+          <w:b/>
+          <w:bCs/>
+          <w:lang w:val="en-US"/>
+        </w:rPr>
+      </w:pPr>
+      <w:r>
+        <w:rPr>
+          <w:b/>
+          <w:bCs/>
+          <w:lang w:val="en-US"/>
+        </w:rPr>
+        <w:t>The IDM-like workflow</w:t>
+      </w:r>
+    </w:p>
+    <w:p>
+      <w:pPr>
+        <w:rPr>
+          <w:lang w:val="en-US"/>
+        </w:rPr>
+      </w:pPr>
+      <w:r>
+        <w:rPr>
+          <w:lang w:val="en-US"/>
+        </w:rPr>
+        <w:t>This is the architecture I would build:</w:t>
+      </w:r>
+    </w:p>
+    <w:p>
+      <w:pPr>
+        <w:rPr>
+          <w:lang w:val="en-US"/>
+        </w:rPr>
+      </w:pPr>
+      <w:r>
+        <w:rPr>
+          <w:lang w:val="en-US"/>
+        </w:rPr>
+        <w:t xml:space="preserve">                  CHROME</w:t>
+      </w:r>
+    </w:p>
+    <w:p>
+      <w:pPr>
+        <w:rPr>
+          <w:lang w:val="en-US"/>
+        </w:rPr>
+      </w:pPr>
+      <w:r>
+        <w:rPr>
+          <w:lang w:val="en-US"/>
+        </w:rPr>
+        <w:t xml:space="preserve">                     │</w:t>
+      </w:r>
+    </w:p>
+    <w:p>
+      <w:pPr>
+        <w:rPr>
+          <w:lang w:val="en-US"/>
+        </w:rPr>
+      </w:pPr>
+      <w:r>
+        <w:rPr>
+          <w:lang w:val="en-US"/>
+        </w:rPr>
+        <w:t xml:space="preserve">                     </w:t>
+      </w:r>
+      <w:r>
+        <w:rPr>
+          <w:rFonts w:ascii="Arial" w:hAnsi="Arial" w:cs="Arial"/>
+          <w:lang w:val="en-US"/>
+        </w:rPr>
+        <w:t>▼</w:t>
+      </w:r>
+    </w:p>
+    <w:p>
+      <w:pPr>
+        <w:rPr>
+          <w:lang w:val="en-US"/>
+        </w:rPr>
+      </w:pPr>
+      <w:r>
+        <w:rPr>
+          <w:lang w:val="en-US"/>
+        </w:rPr>
+        <w:t xml:space="preserve">          ┌───────────────────┐</w:t>
+      </w:r>
+    </w:p>
+    <w:p>
+      <w:pPr>
+        <w:rPr>
+          <w:lang w:val="en-US"/>
+        </w:rPr>
+      </w:pPr>
+      <w:r>
+        <w:rPr>
+          <w:lang w:val="en-US"/>
+        </w:rPr>
+        <w:t xml:space="preserve">          │ DALLFI EXTENSION  │</w:t>
+      </w:r>
+    </w:p>
+    <w:p>
+      <w:pPr>
+        <w:rPr>
+          <w:lang w:val="en-US"/>
+        </w:rPr>
+      </w:pPr>
+      <w:r>
+        <w:rPr>
+          <w:lang w:val="en-US"/>
+        </w:rPr>
+        <w:t xml:space="preserve">          └─────────</w:t>
+      </w:r>
+      <w:r>
+        <w:rPr>
+          <w:rFonts w:ascii="MS Gothic" w:eastAsia="MS Gothic" w:hAnsi="MS Gothic" w:cs="MS Gothic" w:hint="eastAsia"/>
+          <w:lang w:val="en-US"/>
+        </w:rPr>
+        <w:t>┬</w:t>
+      </w:r>
+      <w:r>
+        <w:rPr>
+          <w:rFonts w:ascii="Calibri" w:hAnsi="Calibri" w:cs="Calibri"/>
+          <w:lang w:val="en-US"/>
+        </w:rPr>
+        <w:t>─────────┘</w:t>
+      </w:r>
+    </w:p>
+    <w:p>
+      <w:pPr>
+        <w:rPr>
+          <w:lang w:val="en-US"/>
+        </w:rPr>
+      </w:pPr>
+      <w:r>
+        <w:rPr>
+          <w:lang w:val="en-US"/>
+        </w:rPr>
+        <w:t xml:space="preserve">                    │</w:t>
+      </w:r>
+    </w:p>
+    <w:p>
+      <w:pPr>
+        <w:rPr>
+          <w:lang w:val="en-US"/>
+        </w:rPr>
+      </w:pPr>
+      <w:r>
+        <w:rPr>
+          <w:lang w:val="en-US"/>
+        </w:rPr>
+        <w:t xml:space="preserve">       ┌────────────</w:t>
+      </w:r>
+      <w:r>
+        <w:rPr>
+          <w:rFonts w:ascii="MS Gothic" w:eastAsia="MS Gothic" w:hAnsi="MS Gothic" w:cs="MS Gothic" w:hint="eastAsia"/>
+          <w:lang w:val="en-US"/>
+        </w:rPr>
+        <w:t>┼</w:t>
+      </w:r>
+      <w:r>
+        <w:rPr>
+          <w:rFonts w:ascii="Calibri" w:hAnsi="Calibri" w:cs="Calibri"/>
+          <w:lang w:val="en-US"/>
+        </w:rPr>
+        <w:t>─────────────┐</w:t>
+      </w:r>
+    </w:p>
+    <w:p>
+      <w:pPr>
+        <w:rPr>
+          <w:lang w:val="en-US"/>
+        </w:rPr>
+      </w:pPr>
+      <w:r>
+        <w:rPr>
+          <w:lang w:val="en-US"/>
+        </w:rPr>
+        <w:t xml:space="preserve">       │            │             │</w:t>
+      </w:r>
+    </w:p>
+    <w:p>
+      <w:pPr>
+        <w:rPr>
+          <w:lang w:val="en-US"/>
+        </w:rPr>
+      </w:pPr>
+      <w:r>
+        <w:rPr>
+          <w:lang w:val="en-US"/>
+        </w:rPr>
+        <w:t xml:space="preserve">       </w:t>
+      </w:r>
+      <w:r>
+        <w:rPr>
+          <w:rFonts w:ascii="Arial" w:hAnsi="Arial" w:cs="Arial"/>
+          <w:lang w:val="en-US"/>
+        </w:rPr>
+        <w:t>▼</w:t>
+      </w:r>
+      <w:r>
+        <w:rPr>
+          <w:lang w:val="en-US"/>
+        </w:rPr>
+        <w:t xml:space="preserve">            </w:t>
+      </w:r>
+      <w:r>
+        <w:rPr>
+          <w:rFonts w:ascii="Arial" w:hAnsi="Arial" w:cs="Arial"/>
+          <w:lang w:val="en-US"/>
+        </w:rPr>
+        <w:t>▼</w:t>
+      </w:r>
+      <w:r>
+        <w:rPr>
+          <w:lang w:val="en-US"/>
+        </w:rPr>
+        <w:t xml:space="preserve">             </w:t>
+      </w:r>
+      <w:r>
+        <w:rPr>
+          <w:rFonts w:ascii="Arial" w:hAnsi="Arial" w:cs="Arial"/>
+          <w:lang w:val="en-US"/>
+        </w:rPr>
+        <w:t>▼</w:t>
+      </w:r>
+    </w:p>
+    <w:p>
+      <w:pPr>
+        <w:rPr>
+          <w:lang w:val="en-US"/>
+        </w:rPr>
+      </w:pPr>
+      <w:r>
+        <w:rPr>
+          <w:lang w:val="en-US"/>
+        </w:rPr>
+        <w:t xml:space="preserve">   Links         Media        Network</w:t>
+      </w:r>
+    </w:p>
+    <w:p>
+      <w:pPr>
+        <w:rPr>
+          <w:lang w:val="en-US"/>
+        </w:rPr>
+      </w:pPr>
+      <w:r>
+        <w:rPr>
+          <w:lang w:val="en-US"/>
+        </w:rPr>
+        <w:t xml:space="preserve">   detector      detector     detector</w:t>
+      </w:r>
+    </w:p>
+    <w:p>
+      <w:pPr>
+        <w:rPr>
+          <w:lang w:val="en-US"/>
+        </w:rPr>
+      </w:pPr>
+      <w:r>
+        <w:rPr>
+          <w:lang w:val="en-US"/>
+        </w:rPr>
+        <w:lastRenderedPageBreak/>
+        <w:t xml:space="preserve">       │            │             │</w:t>
+      </w:r>
+    </w:p>
+    <w:p>
+      <w:pPr>
+        <w:rPr>
+          <w:lang w:val="en-US"/>
+        </w:rPr>
+      </w:pPr>
+      <w:r>
+        <w:rPr>
+          <w:lang w:val="en-US"/>
+        </w:rPr>
+        <w:t xml:space="preserve">       └────────────</w:t>
+      </w:r>
+      <w:r>
+        <w:rPr>
+          <w:rFonts w:ascii="MS Gothic" w:eastAsia="MS Gothic" w:hAnsi="MS Gothic" w:cs="MS Gothic" w:hint="eastAsia"/>
+          <w:lang w:val="en-US"/>
+        </w:rPr>
+        <w:t>┼</w:t>
+      </w:r>
+      <w:r>
+        <w:rPr>
+          <w:rFonts w:ascii="Calibri" w:hAnsi="Calibri" w:cs="Calibri"/>
+          <w:lang w:val="en-US"/>
+        </w:rPr>
+        <w:t>─────────────┘</w:t>
+      </w:r>
+    </w:p>
+    <w:p>
+      <w:pPr>
+        <w:rPr>
+          <w:lang w:val="en-US"/>
+        </w:rPr>
+      </w:pPr>
+      <w:r>
+        <w:rPr>
+          <w:lang w:val="en-US"/>
+        </w:rPr>
+        <w:t xml:space="preserve">                    </w:t>
+      </w:r>
+      <w:r>
+        <w:rPr>
+          <w:rFonts w:ascii="Arial" w:hAnsi="Arial" w:cs="Arial"/>
+          <w:lang w:val="en-US"/>
+        </w:rPr>
+        <w:t>▼</w:t>
+      </w:r>
+    </w:p>
+    <w:p>
+      <w:pPr>
+        <w:rPr>
+          <w:lang w:val="en-US"/>
+        </w:rPr>
+      </w:pPr>
+      <w:r>
+        <w:rPr>
+          <w:lang w:val="en-US"/>
+        </w:rPr>
+        <w:t xml:space="preserve">             Download Job</w:t>
+      </w:r>
+    </w:p>
+    <w:p>
+      <w:pPr>
+        <w:rPr>
+          <w:lang w:val="en-US"/>
+        </w:rPr>
+      </w:pPr>
+      <w:r>
+        <w:rPr>
+          <w:lang w:val="en-US"/>
+        </w:rPr>
+        <w:t xml:space="preserve">                    │</w:t>
+      </w:r>
+    </w:p>
+    <w:p>
+      <w:pPr>
+        <w:rPr>
+          <w:lang w:val="en-US"/>
+        </w:rPr>
+      </w:pPr>
+      <w:r>
+        <w:rPr>
+          <w:lang w:val="en-US"/>
+        </w:rPr>
+        <w:t xml:space="preserve">                    </w:t>
+      </w:r>
+      <w:r>
+        <w:rPr>
+          <w:rFonts w:ascii="Arial" w:hAnsi="Arial" w:cs="Arial"/>
+          <w:lang w:val="en-US"/>
+        </w:rPr>
+        <w:t>▼</w:t>
+      </w:r>
+    </w:p>
+    <w:p>
+      <w:pPr>
+        <w:rPr>
+          <w:lang w:val="en-US"/>
+        </w:rPr>
+      </w:pPr>
+      <w:r>
+        <w:rPr>
+          <w:lang w:val="en-US"/>
+        </w:rPr>
+        <w:t xml:space="preserve">             Native Messaging</w:t>
+      </w:r>
+    </w:p>
+    <w:p>
+      <w:pPr>
+        <w:rPr>
+          <w:lang w:val="en-US"/>
+        </w:rPr>
+      </w:pPr>
+      <w:r>
+        <w:rPr>
+          <w:lang w:val="en-US"/>
+        </w:rPr>
+        <w:t xml:space="preserve">                    │</w:t>
+      </w:r>
+    </w:p>
+    <w:p>
+      <w:pPr>
+        <w:rPr>
+          <w:lang w:val="en-US"/>
+        </w:rPr>
+      </w:pPr>
+      <w:r>
+        <w:rPr>
+          <w:lang w:val="en-US"/>
+        </w:rPr>
+        <w:t xml:space="preserve">                    </w:t>
+      </w:r>
+      <w:r>
+        <w:rPr>
+          <w:rFonts w:ascii="Arial" w:hAnsi="Arial" w:cs="Arial"/>
+          <w:lang w:val="en-US"/>
+        </w:rPr>
+        <w:t>▼</w:t>
+      </w:r>
+    </w:p>
+    <w:p>
+      <w:pPr>
+        <w:rPr>
+          <w:lang w:val="en-US"/>
+        </w:rPr>
+      </w:pPr>
+      <w:r>
+        <w:rPr>
+          <w:lang w:val="en-US"/>
+        </w:rPr>
+        <w:t xml:space="preserve">          ┌───────────────────┐</w:t>
+      </w:r>
+    </w:p>
+    <w:p>
+      <w:pPr>
+        <w:rPr>
+          <w:lang w:val="en-US"/>
+        </w:rPr>
+      </w:pPr>
+      <w:r>
+        <w:rPr>
+          <w:lang w:val="en-US"/>
+        </w:rPr>
+        <w:t xml:space="preserve">          │ DALLFI WINDOWS    │</w:t>
+      </w:r>
+    </w:p>
+    <w:p>
+      <w:pPr>
+        <w:rPr>
+          <w:lang w:val="en-US"/>
+        </w:rPr>
+      </w:pPr>
+      <w:r>
+        <w:rPr>
+          <w:lang w:val="en-US"/>
+        </w:rPr>
+        <w:t xml:space="preserve">          └─────────</w:t>
+      </w:r>
+      <w:r>
+        <w:rPr>
+          <w:rFonts w:ascii="MS Gothic" w:eastAsia="MS Gothic" w:hAnsi="MS Gothic" w:cs="MS Gothic" w:hint="eastAsia"/>
+          <w:lang w:val="en-US"/>
+        </w:rPr>
+        <w:t>┬</w:t>
+      </w:r>
+      <w:r>
+        <w:rPr>
+          <w:rFonts w:ascii="Calibri" w:hAnsi="Calibri" w:cs="Calibri"/>
+          <w:lang w:val="en-US"/>
+        </w:rPr>
+        <w:t>─────────┘</w:t>
+      </w:r>
+    </w:p>
+    <w:p>
+      <w:pPr>
+        <w:rPr>
+          <w:lang w:val="en-US"/>
+        </w:rPr>
+      </w:pPr>
+      <w:r>
+        <w:rPr>
+          <w:lang w:val="en-US"/>
+        </w:rPr>
+        <w:t xml:space="preserve">                    </w:t>
+      </w:r>
+      <w:r>
+        <w:rPr>
+          <w:rFonts w:ascii="Arial" w:hAnsi="Arial" w:cs="Arial"/>
+          <w:lang w:val="en-US"/>
+        </w:rPr>
+        <w:t>▼</w:t>
+      </w:r>
+    </w:p>
+    <w:p>
+      <w:pPr>
+        <w:rPr>
+          <w:lang w:val="en-US"/>
+        </w:rPr>
+      </w:pPr>
+      <w:r>
+        <w:rPr>
+          <w:lang w:val="en-US"/>
+        </w:rPr>
+        <w:t xml:space="preserve">             Rust Engine</w:t>
+      </w:r>
+    </w:p>
+    <w:p>
+      <w:pPr>
+        <w:rPr>
+          <w:lang w:val="en-US"/>
+        </w:rPr>
+      </w:pPr>
+      <w:r>
+        <w:rPr>
+          <w:lang w:val="en-US"/>
+        </w:rPr>
+        <w:t xml:space="preserve">                    │</w:t>
+      </w:r>
+    </w:p>
+    <w:p>
+      <w:pPr>
+        <w:rPr>
+          <w:lang w:val="en-US"/>
+        </w:rPr>
+      </w:pPr>
+      <w:r>
+        <w:rPr>
+          <w:lang w:val="en-US"/>
+        </w:rPr>
+        <w:t xml:space="preserve">       ┌────────────</w:t>
+      </w:r>
+      <w:r>
+        <w:rPr>
+          <w:rFonts w:ascii="MS Gothic" w:eastAsia="MS Gothic" w:hAnsi="MS Gothic" w:cs="MS Gothic" w:hint="eastAsia"/>
+          <w:lang w:val="en-US"/>
+        </w:rPr>
+        <w:t>┼</w:t>
+      </w:r>
+      <w:r>
+        <w:rPr>
+          <w:rFonts w:ascii="Calibri" w:hAnsi="Calibri" w:cs="Calibri"/>
+          <w:lang w:val="en-US"/>
+        </w:rPr>
+        <w:t>─────────────┐</w:t>
+      </w:r>
+    </w:p>
+    <w:p>
+      <w:pPr>
+        <w:rPr>
+          <w:lang w:val="en-US"/>
+        </w:rPr>
+      </w:pPr>
+      <w:r>
+        <w:rPr>
+          <w:lang w:val="en-US"/>
+        </w:rPr>
+        <w:t xml:space="preserve">       </w:t>
+      </w:r>
+      <w:r>
+        <w:rPr>
+          <w:rFonts w:ascii="Arial" w:hAnsi="Arial" w:cs="Arial"/>
+          <w:lang w:val="en-US"/>
+        </w:rPr>
+        <w:t>▼</w:t>
+      </w:r>
+      <w:r>
+        <w:rPr>
+          <w:lang w:val="en-US"/>
+        </w:rPr>
+        <w:t xml:space="preserve">            </w:t>
+      </w:r>
+      <w:r>
+        <w:rPr>
+          <w:rFonts w:ascii="Arial" w:hAnsi="Arial" w:cs="Arial"/>
+          <w:lang w:val="en-US"/>
+        </w:rPr>
+        <w:t>▼</w:t>
+      </w:r>
+      <w:r>
+        <w:rPr>
+          <w:lang w:val="en-US"/>
+        </w:rPr>
+        <w:t xml:space="preserve">             </w:t>
+      </w:r>
+      <w:r>
+        <w:rPr>
+          <w:rFonts w:ascii="Arial" w:hAnsi="Arial" w:cs="Arial"/>
+          <w:lang w:val="en-US"/>
+        </w:rPr>
+        <w:t>▼</w:t>
+      </w:r>
+    </w:p>
+    <w:p>
+      <w:pPr>
+        <w:rPr>
+          <w:lang w:val="en-US"/>
+        </w:rPr>
+      </w:pPr>
+      <w:r>
+        <w:rPr>
+          <w:lang w:val="en-US"/>
+        </w:rPr>
+        <w:t xml:space="preserve">   Downloader      Queue      Scheduler</w:t>
+      </w:r>
+    </w:p>
+    <w:p>
+      <w:pPr>
+        <w:rPr>
+          <w:lang w:val="en-US"/>
+        </w:rPr>
+      </w:pPr>
+      <w:r>
+        <w:rPr>
+          <w:lang w:val="en-US"/>
+        </w:rPr>
+        <w:t xml:space="preserve">       │</w:t>
+      </w:r>
+    </w:p>
+    <w:p>
+      <w:pPr>
+        <w:rPr>
+          <w:lang w:val="en-US"/>
+        </w:rPr>
+      </w:pPr>
+      <w:r>
+        <w:rPr>
+          <w:lang w:val="en-US"/>
+        </w:rPr>
+        <w:t xml:space="preserve">       </w:t>
+      </w:r>
+      <w:r>
+        <w:rPr>
+          <w:rFonts w:ascii="Arial" w:hAnsi="Arial" w:cs="Arial"/>
+          <w:lang w:val="en-US"/>
+        </w:rPr>
+        <w:t>▼</w:t>
+      </w:r>
+    </w:p>
+    <w:p>
+      <w:pPr>
+        <w:rPr>
+          <w:lang w:val="en-US"/>
+        </w:rPr>
+      </w:pPr>
+      <w:r>
+        <w:rPr>
+          <w:lang w:val="en-US"/>
+        </w:rPr>
+        <w:t xml:space="preserve">   Connections</w:t>
+      </w:r>
+    </w:p>
+    <w:p>
+      <w:pPr>
+        <w:rPr>
+          <w:lang w:val="en-US"/>
+        </w:rPr>
+      </w:pPr>
+      <w:r>
+        <w:rPr>
+          <w:lang w:val="en-US"/>
+        </w:rPr>
+        <w:t xml:space="preserve">       │</w:t>
+      </w:r>
+    </w:p>
+    <w:p>
+      <w:pPr>
+        <w:rPr>
+          <w:lang w:val="en-US"/>
+        </w:rPr>
+      </w:pPr>
+      <w:r>
+        <w:rPr>
+          <w:lang w:val="en-US"/>
+        </w:rPr>
+        <w:t xml:space="preserve">       </w:t>
+      </w:r>
+      <w:r>
+        <w:rPr>
+          <w:rFonts w:ascii="Arial" w:hAnsi="Arial" w:cs="Arial"/>
+          <w:lang w:val="en-US"/>
+        </w:rPr>
+        <w:t>▼</w:t>
+      </w:r>
+    </w:p>
+    <w:p>
+      <w:pPr>
+        <w:rPr>
+          <w:lang w:val="en-US"/>
+        </w:rPr>
+      </w:pPr>
+      <w:r>
+        <w:rPr>
+          <w:lang w:val="en-US"/>
+        </w:rPr>
+        <w:t xml:space="preserve">    File System</w:t>
+      </w:r>
+    </w:p>
+    <w:p>
+      <w:pPr>
+        <w:rPr>
+          <w:lang w:val="en-US"/>
+        </w:rPr>
+      </w:pPr>
+      <w:r>
+        <w:rPr>
+          <w:lang w:val="en-US"/>
+        </w:rPr>
+        <w:t xml:space="preserve">That is a </w:t>
+      </w:r>
+      <w:r>
+        <w:rPr>
+          <w:b/>
+          <w:bCs/>
+          <w:lang w:val="en-US"/>
+        </w:rPr>
+        <w:t>real IDM-style architecture</w:t>
+      </w:r>
+      <w:r>
+        <w:rPr>
+          <w:lang w:val="en-US"/>
+        </w:rPr>
+        <w:t>, not just a browser extension that calls chrome.downloads.</w:t>
+      </w:r>
+    </w:p>
+    <w:p>
+      <w:r>
+        <w:pict w14:anchorId="20E035A4">
+          <v:rect id="_x0000_i1108" style="width:0;height:1.5pt" o:hralign="center" o:hrstd="t" o:hr="t" fillcolor="#a0a0a0" stroked="f"/>
+        </w:pict>
+      </w:r>
+    </w:p>
+    <w:p>
+      <w:pPr>
+        <w:rPr>
+          <w:b/>
+          <w:bCs/>
+          <w:lang w:val="en-US"/>
+        </w:rPr>
+      </w:pPr>
+      <w:r>
+        <w:rPr>
+          <w:b/>
+          <w:bCs/>
+          <w:lang w:val="en-US"/>
+        </w:rPr>
+        <w:t>Why Rust should do the actual download</w:t>
+      </w:r>
+    </w:p>
+    <w:p>
+      <w:pPr>
+        <w:rPr>
+          <w:lang w:val="en-US"/>
+        </w:rPr>
+      </w:pPr>
+      <w:r>
+        <w:rPr>
+          <w:lang w:val="en-US"/>
+        </w:rPr>
+        <w:lastRenderedPageBreak/>
+        <w:t>Don't make the extension download large files itself.</w:t>
+      </w:r>
+    </w:p>
+    <w:p>
+      <w:pPr>
+        <w:rPr>
+          <w:lang w:val="en-US"/>
+        </w:rPr>
+      </w:pPr>
+      <w:r>
+        <w:rPr>
+          <w:lang w:val="en-US"/>
+        </w:rPr>
+        <w:t>Instead:</w:t>
+      </w:r>
+    </w:p>
+    <w:p>
+      <w:pPr>
+        <w:rPr>
+          <w:lang w:val="en-US"/>
+        </w:rPr>
+      </w:pPr>
+      <w:r>
+        <w:rPr>
+          <w:lang w:val="en-US"/>
+        </w:rPr>
+        <w:t>Extension = brain/bridge</w:t>
+      </w:r>
+    </w:p>
+    <w:p>
+      <w:pPr>
+        <w:rPr>
+          <w:lang w:val="en-US"/>
+        </w:rPr>
+      </w:pPr>
+      <w:r>
+        <w:rPr>
+          <w:lang w:val="en-US"/>
+        </w:rPr>
+        <w:t>Rust = engine</w:t>
+      </w:r>
+    </w:p>
+    <w:p>
+      <w:pPr>
+        <w:rPr>
+          <w:lang w:val="en-US"/>
+        </w:rPr>
+      </w:pPr>
+      <w:r>
+        <w:rPr>
+          <w:lang w:val="en-US"/>
+        </w:rPr>
+        <w:t>The extension says:</w:t>
+      </w:r>
+    </w:p>
+    <w:p>
+      <w:pPr>
+        <w:rPr>
+          <w:lang w:val="en-US"/>
+        </w:rPr>
+      </w:pPr>
+      <w:r>
+        <w:rPr>
+          <w:lang w:val="en-US"/>
+        </w:rPr>
+        <w:t>{</w:t>
+      </w:r>
+    </w:p>
+    <w:p>
+      <w:pPr>
+        <w:rPr>
+          <w:lang w:val="en-US"/>
+        </w:rPr>
+      </w:pPr>
+      <w:r>
+        <w:rPr>
+          <w:lang w:val="en-US"/>
+        </w:rPr>
+        <w:t xml:space="preserve">  "type": "DOWNLOAD",</w:t>
+      </w:r>
+    </w:p>
+    <w:p>
+      <w:pPr>
+        <w:rPr>
+          <w:lang w:val="en-US"/>
+        </w:rPr>
+      </w:pPr>
+      <w:r>
+        <w:rPr>
+          <w:lang w:val="en-US"/>
+        </w:rPr>
+        <w:t xml:space="preserve">  "url": "...",</w:t>
+      </w:r>
+    </w:p>
+    <w:p>
+      <w:pPr>
+        <w:rPr>
+          <w:lang w:val="en-US"/>
+        </w:rPr>
+      </w:pPr>
+      <w:r>
+        <w:rPr>
+          <w:lang w:val="en-US"/>
+        </w:rPr>
+        <w:t xml:space="preserve">  "filename": "video.mp4"</w:t>
+      </w:r>
+    </w:p>
+    <w:p>
+      <w:pPr>
+        <w:rPr>
+          <w:lang w:val="en-US"/>
+        </w:rPr>
+      </w:pPr>
+      <w:r>
+        <w:rPr>
+          <w:lang w:val="en-US"/>
+        </w:rPr>
+        <w:t>}</w:t>
+      </w:r>
+    </w:p>
+    <w:p>
+      <w:pPr>
+        <w:rPr>
+          <w:lang w:val="en-US"/>
+        </w:rPr>
+      </w:pPr>
+      <w:r>
+        <w:rPr>
+          <w:lang w:val="en-US"/>
+        </w:rPr>
+        <w:t>Rust receives the job.</w:t>
+      </w:r>
     </w:p>
     <w:p>
       <w:pPr>

</xml_diff>